<commit_message>
Corrige planeacion diaria y cronograma: 1 dia por bloque = vuelo + proceso
</commit_message>
<xml_diff>
--- a/Proyectos/Tampico_SanLuis/PLANEACION_DIARIA.docx
+++ b/Proyectos/Tampico_SanLuis/PLANEACION_DIARIA.docx
@@ -8,7 +8,7 @@
         <w:jc w:val="center"/>
       </w:pPr>
       <w:r>
-        <w:t>Planeacion Diaria de Vuelo: Tampico - San Luis Potosi</w:t>
+        <w:t>Planeacion Diaria: TAMPICO - SAN LUIS</w:t>
       </w:r>
     </w:p>
     <w:p>
@@ -18,7 +18,7 @@
     </w:p>
     <w:p>
       <w:r>
-        <w:t>Fecha de inicio sugerida: 01 de April de 2026</w:t>
+        <w:t>Fecha de inicio: 30 de March de 2026</w:t>
       </w:r>
     </w:p>
     <w:p/>
@@ -27,2662 +27,41 @@
         <w:pStyle w:val="Heading1"/>
       </w:pPr>
       <w:r>
-        <w:t>Resumen del Proyecto</w:t>
+        <w:t>Resumen</w:t>
       </w:r>
     </w:p>
     <w:p>
       <w:r>
-        <w:rPr>
-          <w:b/>
-        </w:rPr>
-        <w:t xml:space="preserve">Total de bloques de trabajo: </w:t>
-      </w:r>
-      <w:r>
-        <w:t>9</w:t>
+        <w:t>Bloques: 9</w:t>
       </w:r>
     </w:p>
     <w:p>
       <w:r>
-        <w:rPr>
-          <w:b/>
-        </w:rPr>
-        <w:t xml:space="preserve">Total de kilometros: </w:t>
-      </w:r>
-      <w:r>
-        <w:t>412.2 km</w:t>
+        <w:t>Kilometros totales: 412.2 km</w:t>
       </w:r>
     </w:p>
     <w:p>
       <w:r>
-        <w:rPr>
-          <w:b/>
-        </w:rPr>
-        <w:t xml:space="preserve">Tiempo total de vuelo estimado: </w:t>
-      </w:r>
-      <w:r>
-        <w:t>8.3 horas</w:t>
+        <w:t>Dias de vuelo: 9</w:t>
       </w:r>
     </w:p>
     <w:p>
       <w:r>
-        <w:rPr>
-          <w:b/>
-        </w:rPr>
-        <w:t xml:space="preserve">Baterias necesarias (estimado): </w:t>
-      </w:r>
-      <w:r>
-        <w:t>45</w:t>
+        <w:t>Dias de procesamiento: 9</w:t>
       </w:r>
     </w:p>
     <w:p>
       <w:r>
-        <w:rPr>
-          <w:b/>
-        </w:rPr>
-        <w:t xml:space="preserve">Dias de vuelo estimados (4 bloques/dia): </w:t>
-      </w:r>
-      <w:r>
-        <w:t>2.2 dias</w:t>
+        <w:t>Total dias: 18</w:t>
       </w:r>
     </w:p>
-    <w:p>
-      <w:r>
-        <w:br w:type="page"/>
-      </w:r>
-    </w:p>
+    <w:p/>
     <w:p>
       <w:pPr>
         <w:pStyle w:val="Heading1"/>
       </w:pPr>
       <w:r>
-        <w:t>Dias de Trabajo por Bloque</w:t>
-      </w:r>
-    </w:p>
-    <w:p>
-      <w:pPr>
-        <w:pStyle w:val="Heading2"/>
-      </w:pPr>
-      <w:r>
-        <w:t>Bloque 1 - 01 Apr</w:t>
-      </w:r>
-    </w:p>
-    <w:tbl>
-      <w:tblPr>
-        <w:tblStyle w:val="TableGrid"/>
-        <w:tblW w:type="auto" w:w="0"/>
-        <w:tblLook w:firstColumn="1" w:firstRow="1" w:lastColumn="0" w:lastRow="0" w:noHBand="0" w:noVBand="1" w:val="04A0"/>
-      </w:tblPr>
-      <w:tblGrid>
-        <w:gridCol w:w="2160"/>
-        <w:gridCol w:w="2160"/>
-        <w:gridCol w:w="2160"/>
-        <w:gridCol w:w="2160"/>
-      </w:tblGrid>
-      <w:tr>
-        <w:tc>
-          <w:tcPr>
-            <w:tcW w:type="dxa" w:w="2160"/>
-          </w:tcPr>
-          <w:p>
-            <w:r>
-              <w:t>Segmento</w:t>
-            </w:r>
-          </w:p>
-        </w:tc>
-        <w:tc>
-          <w:tcPr>
-            <w:tcW w:type="dxa" w:w="2160"/>
-          </w:tcPr>
-          <w:p>
-            <w:r>
-              <w:t>Nombre</w:t>
-            </w:r>
-          </w:p>
-        </w:tc>
-        <w:tc>
-          <w:tcPr>
-            <w:tcW w:type="dxa" w:w="2160"/>
-          </w:tcPr>
-          <w:p>
-            <w:r>
-              <w:t>km</w:t>
-            </w:r>
-          </w:p>
-        </w:tc>
-        <w:tc>
-          <w:tcPr>
-            <w:tcW w:type="dxa" w:w="2160"/>
-          </w:tcPr>
-          <w:p>
-            <w:r>
-              <w:t>Tiempo min</w:t>
-            </w:r>
-          </w:p>
-        </w:tc>
-      </w:tr>
-      <w:tr>
-        <w:tc>
-          <w:tcPr>
-            <w:tcW w:type="dxa" w:w="2160"/>
-          </w:tcPr>
-          <w:p>
-            <w:r>
-              <w:t>1</w:t>
-            </w:r>
-          </w:p>
-        </w:tc>
-        <w:tc>
-          <w:tcPr>
-            <w:tcW w:type="dxa" w:w="2160"/>
-          </w:tcPr>
-          <w:p>
-            <w:r>
-              <w:t>01 Canalizacion minicepa</w:t>
-            </w:r>
-          </w:p>
-        </w:tc>
-        <w:tc>
-          <w:tcPr>
-            <w:tcW w:type="dxa" w:w="2160"/>
-          </w:tcPr>
-          <w:p>
-            <w:r>
-              <w:t>15.0</w:t>
-            </w:r>
-          </w:p>
-        </w:tc>
-        <w:tc>
-          <w:tcPr>
-            <w:tcW w:type="dxa" w:w="2160"/>
-          </w:tcPr>
-          <w:p>
-            <w:r>
-              <w:t>12</w:t>
-            </w:r>
-          </w:p>
-        </w:tc>
-      </w:tr>
-      <w:tr>
-        <w:tc>
-          <w:tcPr>
-            <w:tcW w:type="dxa" w:w="2160"/>
-          </w:tcPr>
-          <w:p>
-            <w:r>
-              <w:t>2</w:t>
-            </w:r>
-          </w:p>
-        </w:tc>
-        <w:tc>
-          <w:tcPr>
-            <w:tcW w:type="dxa" w:w="2160"/>
-          </w:tcPr>
-          <w:p>
-            <w:r>
-              <w:t>02 Canalizacion tipo A</w:t>
-            </w:r>
-          </w:p>
-        </w:tc>
-        <w:tc>
-          <w:tcPr>
-            <w:tcW w:type="dxa" w:w="2160"/>
-          </w:tcPr>
-          <w:p>
-            <w:r>
-              <w:t>5.7</w:t>
-            </w:r>
-          </w:p>
-        </w:tc>
-        <w:tc>
-          <w:tcPr>
-            <w:tcW w:type="dxa" w:w="2160"/>
-          </w:tcPr>
-          <w:p>
-            <w:r>
-              <w:t>11</w:t>
-            </w:r>
-          </w:p>
-        </w:tc>
-      </w:tr>
-      <w:tr>
-        <w:tc>
-          <w:tcPr>
-            <w:tcW w:type="dxa" w:w="2160"/>
-          </w:tcPr>
-          <w:p>
-            <w:r>
-              <w:t>3</w:t>
-            </w:r>
-          </w:p>
-        </w:tc>
-        <w:tc>
-          <w:tcPr>
-            <w:tcW w:type="dxa" w:w="2160"/>
-          </w:tcPr>
-          <w:p>
-            <w:r>
-              <w:t>03 Canalizacion tipo A</w:t>
-            </w:r>
-          </w:p>
-        </w:tc>
-        <w:tc>
-          <w:tcPr>
-            <w:tcW w:type="dxa" w:w="2160"/>
-          </w:tcPr>
-          <w:p>
-            <w:r>
-              <w:t>24.4</w:t>
-            </w:r>
-          </w:p>
-        </w:tc>
-        <w:tc>
-          <w:tcPr>
-            <w:tcW w:type="dxa" w:w="2160"/>
-          </w:tcPr>
-          <w:p>
-            <w:r>
-              <w:t>13</w:t>
-            </w:r>
-          </w:p>
-        </w:tc>
-      </w:tr>
-      <w:tr>
-        <w:tc>
-          <w:tcPr>
-            <w:tcW w:type="dxa" w:w="2160"/>
-          </w:tcPr>
-          <w:p>
-            <w:r>
-              <w:t>4</w:t>
-            </w:r>
-          </w:p>
-        </w:tc>
-        <w:tc>
-          <w:tcPr>
-            <w:tcW w:type="dxa" w:w="2160"/>
-          </w:tcPr>
-          <w:p>
-            <w:r>
-              <w:t>04 Canalizacion tipo A</w:t>
-            </w:r>
-          </w:p>
-        </w:tc>
-        <w:tc>
-          <w:tcPr>
-            <w:tcW w:type="dxa" w:w="2160"/>
-          </w:tcPr>
-          <w:p>
-            <w:r>
-              <w:t>5.0</w:t>
-            </w:r>
-          </w:p>
-        </w:tc>
-        <w:tc>
-          <w:tcPr>
-            <w:tcW w:type="dxa" w:w="2160"/>
-          </w:tcPr>
-          <w:p>
-            <w:r>
-              <w:t>11</w:t>
-            </w:r>
-          </w:p>
-        </w:tc>
-      </w:tr>
-    </w:tbl>
-    <w:p/>
-    <w:p>
-      <w:r>
-        <w:rPr>
-          <w:b/>
-        </w:rPr>
-        <w:t xml:space="preserve">Total bloque 1: </w:t>
-      </w:r>
-      <w:r>
-        <w:t>50.0 km, 46 min, ~4 baterias</w:t>
-      </w:r>
-    </w:p>
-    <w:p/>
-    <w:p>
-      <w:pPr>
-        <w:pStyle w:val="Heading2"/>
-      </w:pPr>
-      <w:r>
-        <w:t>Bloque 2 - 01 Apr</w:t>
-      </w:r>
-    </w:p>
-    <w:tbl>
-      <w:tblPr>
-        <w:tblStyle w:val="TableGrid"/>
-        <w:tblW w:type="auto" w:w="0"/>
-        <w:tblLook w:firstColumn="1" w:firstRow="1" w:lastColumn="0" w:lastRow="0" w:noHBand="0" w:noVBand="1" w:val="04A0"/>
-      </w:tblPr>
-      <w:tblGrid>
-        <w:gridCol w:w="2160"/>
-        <w:gridCol w:w="2160"/>
-        <w:gridCol w:w="2160"/>
-        <w:gridCol w:w="2160"/>
-      </w:tblGrid>
-      <w:tr>
-        <w:tc>
-          <w:tcPr>
-            <w:tcW w:type="dxa" w:w="2160"/>
-          </w:tcPr>
-          <w:p>
-            <w:r>
-              <w:t>Segmento</w:t>
-            </w:r>
-          </w:p>
-        </w:tc>
-        <w:tc>
-          <w:tcPr>
-            <w:tcW w:type="dxa" w:w="2160"/>
-          </w:tcPr>
-          <w:p>
-            <w:r>
-              <w:t>Nombre</w:t>
-            </w:r>
-          </w:p>
-        </w:tc>
-        <w:tc>
-          <w:tcPr>
-            <w:tcW w:type="dxa" w:w="2160"/>
-          </w:tcPr>
-          <w:p>
-            <w:r>
-              <w:t>km</w:t>
-            </w:r>
-          </w:p>
-        </w:tc>
-        <w:tc>
-          <w:tcPr>
-            <w:tcW w:type="dxa" w:w="2160"/>
-          </w:tcPr>
-          <w:p>
-            <w:r>
-              <w:t>Tiempo min</w:t>
-            </w:r>
-          </w:p>
-        </w:tc>
-      </w:tr>
-      <w:tr>
-        <w:tc>
-          <w:tcPr>
-            <w:tcW w:type="dxa" w:w="2160"/>
-          </w:tcPr>
-          <w:p>
-            <w:r>
-              <w:t>5</w:t>
-            </w:r>
-          </w:p>
-        </w:tc>
-        <w:tc>
-          <w:tcPr>
-            <w:tcW w:type="dxa" w:w="2160"/>
-          </w:tcPr>
-          <w:p>
-            <w:r>
-              <w:t>04 Canalizacion tipo A</w:t>
-            </w:r>
-          </w:p>
-        </w:tc>
-        <w:tc>
-          <w:tcPr>
-            <w:tcW w:type="dxa" w:w="2160"/>
-          </w:tcPr>
-          <w:p>
-            <w:r>
-              <w:t>10.7</w:t>
-            </w:r>
-          </w:p>
-        </w:tc>
-        <w:tc>
-          <w:tcPr>
-            <w:tcW w:type="dxa" w:w="2160"/>
-          </w:tcPr>
-          <w:p>
-            <w:r>
-              <w:t>11</w:t>
-            </w:r>
-          </w:p>
-        </w:tc>
-      </w:tr>
-      <w:tr>
-        <w:tc>
-          <w:tcPr>
-            <w:tcW w:type="dxa" w:w="2160"/>
-          </w:tcPr>
-          <w:p>
-            <w:r>
-              <w:t>6</w:t>
-            </w:r>
-          </w:p>
-        </w:tc>
-        <w:tc>
-          <w:tcPr>
-            <w:tcW w:type="dxa" w:w="2160"/>
-          </w:tcPr>
-          <w:p>
-            <w:r>
-              <w:t>05 Canalizacion tipo A</w:t>
-            </w:r>
-          </w:p>
-        </w:tc>
-        <w:tc>
-          <w:tcPr>
-            <w:tcW w:type="dxa" w:w="2160"/>
-          </w:tcPr>
-          <w:p>
-            <w:r>
-              <w:t>3.3</w:t>
-            </w:r>
-          </w:p>
-        </w:tc>
-        <w:tc>
-          <w:tcPr>
-            <w:tcW w:type="dxa" w:w="2160"/>
-          </w:tcPr>
-          <w:p>
-            <w:r>
-              <w:t>10</w:t>
-            </w:r>
-          </w:p>
-        </w:tc>
-      </w:tr>
-      <w:tr>
-        <w:tc>
-          <w:tcPr>
-            <w:tcW w:type="dxa" w:w="2160"/>
-          </w:tcPr>
-          <w:p>
-            <w:r>
-              <w:t>7</w:t>
-            </w:r>
-          </w:p>
-        </w:tc>
-        <w:tc>
-          <w:tcPr>
-            <w:tcW w:type="dxa" w:w="2160"/>
-          </w:tcPr>
-          <w:p>
-            <w:r>
-              <w:t>06 Canalizacion tipo A</w:t>
-            </w:r>
-          </w:p>
-        </w:tc>
-        <w:tc>
-          <w:tcPr>
-            <w:tcW w:type="dxa" w:w="2160"/>
-          </w:tcPr>
-          <w:p>
-            <w:r>
-              <w:t>17.3</w:t>
-            </w:r>
-          </w:p>
-        </w:tc>
-        <w:tc>
-          <w:tcPr>
-            <w:tcW w:type="dxa" w:w="2160"/>
-          </w:tcPr>
-          <w:p>
-            <w:r>
-              <w:t>12</w:t>
-            </w:r>
-          </w:p>
-        </w:tc>
-      </w:tr>
-      <w:tr>
-        <w:tc>
-          <w:tcPr>
-            <w:tcW w:type="dxa" w:w="2160"/>
-          </w:tcPr>
-          <w:p>
-            <w:r>
-              <w:t>8</w:t>
-            </w:r>
-          </w:p>
-        </w:tc>
-        <w:tc>
-          <w:tcPr>
-            <w:tcW w:type="dxa" w:w="2160"/>
-          </w:tcPr>
-          <w:p>
-            <w:r>
-              <w:t>07 Canalizacion tipo A</w:t>
-            </w:r>
-          </w:p>
-        </w:tc>
-        <w:tc>
-          <w:tcPr>
-            <w:tcW w:type="dxa" w:w="2160"/>
-          </w:tcPr>
-          <w:p>
-            <w:r>
-              <w:t>3.9</w:t>
-            </w:r>
-          </w:p>
-        </w:tc>
-        <w:tc>
-          <w:tcPr>
-            <w:tcW w:type="dxa" w:w="2160"/>
-          </w:tcPr>
-          <w:p>
-            <w:r>
-              <w:t>10</w:t>
-            </w:r>
-          </w:p>
-        </w:tc>
-      </w:tr>
-      <w:tr>
-        <w:tc>
-          <w:tcPr>
-            <w:tcW w:type="dxa" w:w="2160"/>
-          </w:tcPr>
-          <w:p>
-            <w:r>
-              <w:t>9</w:t>
-            </w:r>
-          </w:p>
-        </w:tc>
-        <w:tc>
-          <w:tcPr>
-            <w:tcW w:type="dxa" w:w="2160"/>
-          </w:tcPr>
-          <w:p>
-            <w:r>
-              <w:t>08 Canalizacion tipo A</w:t>
-            </w:r>
-          </w:p>
-        </w:tc>
-        <w:tc>
-          <w:tcPr>
-            <w:tcW w:type="dxa" w:w="2160"/>
-          </w:tcPr>
-          <w:p>
-            <w:r>
-              <w:t>14.7</w:t>
-            </w:r>
-          </w:p>
-        </w:tc>
-        <w:tc>
-          <w:tcPr>
-            <w:tcW w:type="dxa" w:w="2160"/>
-          </w:tcPr>
-          <w:p>
-            <w:r>
-              <w:t>12</w:t>
-            </w:r>
-          </w:p>
-        </w:tc>
-      </w:tr>
-    </w:tbl>
-    <w:p/>
-    <w:p>
-      <w:r>
-        <w:rPr>
-          <w:b/>
-        </w:rPr>
-        <w:t xml:space="preserve">Total bloque 2: </w:t>
-      </w:r>
-      <w:r>
-        <w:t>50.0 km, 56 min, ~5 baterias</w:t>
-      </w:r>
-    </w:p>
-    <w:p/>
-    <w:p>
-      <w:pPr>
-        <w:pStyle w:val="Heading2"/>
-      </w:pPr>
-      <w:r>
-        <w:t>Bloque 3 - 01 Apr</w:t>
-      </w:r>
-    </w:p>
-    <w:tbl>
-      <w:tblPr>
-        <w:tblStyle w:val="TableGrid"/>
-        <w:tblW w:type="auto" w:w="0"/>
-        <w:tblLook w:firstColumn="1" w:firstRow="1" w:lastColumn="0" w:lastRow="0" w:noHBand="0" w:noVBand="1" w:val="04A0"/>
-      </w:tblPr>
-      <w:tblGrid>
-        <w:gridCol w:w="2160"/>
-        <w:gridCol w:w="2160"/>
-        <w:gridCol w:w="2160"/>
-        <w:gridCol w:w="2160"/>
-      </w:tblGrid>
-      <w:tr>
-        <w:tc>
-          <w:tcPr>
-            <w:tcW w:type="dxa" w:w="2160"/>
-          </w:tcPr>
-          <w:p>
-            <w:r>
-              <w:t>Segmento</w:t>
-            </w:r>
-          </w:p>
-        </w:tc>
-        <w:tc>
-          <w:tcPr>
-            <w:tcW w:type="dxa" w:w="2160"/>
-          </w:tcPr>
-          <w:p>
-            <w:r>
-              <w:t>Nombre</w:t>
-            </w:r>
-          </w:p>
-        </w:tc>
-        <w:tc>
-          <w:tcPr>
-            <w:tcW w:type="dxa" w:w="2160"/>
-          </w:tcPr>
-          <w:p>
-            <w:r>
-              <w:t>km</w:t>
-            </w:r>
-          </w:p>
-        </w:tc>
-        <w:tc>
-          <w:tcPr>
-            <w:tcW w:type="dxa" w:w="2160"/>
-          </w:tcPr>
-          <w:p>
-            <w:r>
-              <w:t>Tiempo min</w:t>
-            </w:r>
-          </w:p>
-        </w:tc>
-      </w:tr>
-      <w:tr>
-        <w:tc>
-          <w:tcPr>
-            <w:tcW w:type="dxa" w:w="2160"/>
-          </w:tcPr>
-          <w:p>
-            <w:r>
-              <w:t>10</w:t>
-            </w:r>
-          </w:p>
-        </w:tc>
-        <w:tc>
-          <w:tcPr>
-            <w:tcW w:type="dxa" w:w="2160"/>
-          </w:tcPr>
-          <w:p>
-            <w:r>
-              <w:t>08 Canalizacion tipo A</w:t>
-            </w:r>
-          </w:p>
-        </w:tc>
-        <w:tc>
-          <w:tcPr>
-            <w:tcW w:type="dxa" w:w="2160"/>
-          </w:tcPr>
-          <w:p>
-            <w:r>
-              <w:t>13.3</w:t>
-            </w:r>
-          </w:p>
-        </w:tc>
-        <w:tc>
-          <w:tcPr>
-            <w:tcW w:type="dxa" w:w="2160"/>
-          </w:tcPr>
-          <w:p>
-            <w:r>
-              <w:t>12</w:t>
-            </w:r>
-          </w:p>
-        </w:tc>
-      </w:tr>
-      <w:tr>
-        <w:tc>
-          <w:tcPr>
-            <w:tcW w:type="dxa" w:w="2160"/>
-          </w:tcPr>
-          <w:p>
-            <w:r>
-              <w:t>11</w:t>
-            </w:r>
-          </w:p>
-        </w:tc>
-        <w:tc>
-          <w:tcPr>
-            <w:tcW w:type="dxa" w:w="2160"/>
-          </w:tcPr>
-          <w:p>
-            <w:r>
-              <w:t>09 Canalizacion minicepa</w:t>
-            </w:r>
-          </w:p>
-        </w:tc>
-        <w:tc>
-          <w:tcPr>
-            <w:tcW w:type="dxa" w:w="2160"/>
-          </w:tcPr>
-          <w:p>
-            <w:r>
-              <w:t>2.8</w:t>
-            </w:r>
-          </w:p>
-        </w:tc>
-        <w:tc>
-          <w:tcPr>
-            <w:tcW w:type="dxa" w:w="2160"/>
-          </w:tcPr>
-          <w:p>
-            <w:r>
-              <w:t>10</w:t>
-            </w:r>
-          </w:p>
-        </w:tc>
-      </w:tr>
-      <w:tr>
-        <w:tc>
-          <w:tcPr>
-            <w:tcW w:type="dxa" w:w="2160"/>
-          </w:tcPr>
-          <w:p>
-            <w:r>
-              <w:t>12</w:t>
-            </w:r>
-          </w:p>
-        </w:tc>
-        <w:tc>
-          <w:tcPr>
-            <w:tcW w:type="dxa" w:w="2160"/>
-          </w:tcPr>
-          <w:p>
-            <w:r>
-              <w:t>010 Canalizacion tipo A</w:t>
-            </w:r>
-          </w:p>
-        </w:tc>
-        <w:tc>
-          <w:tcPr>
-            <w:tcW w:type="dxa" w:w="2160"/>
-          </w:tcPr>
-          <w:p>
-            <w:r>
-              <w:t>4.1</w:t>
-            </w:r>
-          </w:p>
-        </w:tc>
-        <w:tc>
-          <w:tcPr>
-            <w:tcW w:type="dxa" w:w="2160"/>
-          </w:tcPr>
-          <w:p>
-            <w:r>
-              <w:t>10</w:t>
-            </w:r>
-          </w:p>
-        </w:tc>
-      </w:tr>
-      <w:tr>
-        <w:tc>
-          <w:tcPr>
-            <w:tcW w:type="dxa" w:w="2160"/>
-          </w:tcPr>
-          <w:p>
-            <w:r>
-              <w:t>13</w:t>
-            </w:r>
-          </w:p>
-        </w:tc>
-        <w:tc>
-          <w:tcPr>
-            <w:tcW w:type="dxa" w:w="2160"/>
-          </w:tcPr>
-          <w:p>
-            <w:r>
-              <w:t>011 Canalizacion tipo A</w:t>
-            </w:r>
-          </w:p>
-        </w:tc>
-        <w:tc>
-          <w:tcPr>
-            <w:tcW w:type="dxa" w:w="2160"/>
-          </w:tcPr>
-          <w:p>
-            <w:r>
-              <w:t>4.1</w:t>
-            </w:r>
-          </w:p>
-        </w:tc>
-        <w:tc>
-          <w:tcPr>
-            <w:tcW w:type="dxa" w:w="2160"/>
-          </w:tcPr>
-          <w:p>
-            <w:r>
-              <w:t>10</w:t>
-            </w:r>
-          </w:p>
-        </w:tc>
-      </w:tr>
-      <w:tr>
-        <w:tc>
-          <w:tcPr>
-            <w:tcW w:type="dxa" w:w="2160"/>
-          </w:tcPr>
-          <w:p>
-            <w:r>
-              <w:t>14</w:t>
-            </w:r>
-          </w:p>
-        </w:tc>
-        <w:tc>
-          <w:tcPr>
-            <w:tcW w:type="dxa" w:w="2160"/>
-          </w:tcPr>
-          <w:p>
-            <w:r>
-              <w:t>012 Canalizacion tipo A</w:t>
-            </w:r>
-          </w:p>
-        </w:tc>
-        <w:tc>
-          <w:tcPr>
-            <w:tcW w:type="dxa" w:w="2160"/>
-          </w:tcPr>
-          <w:p>
-            <w:r>
-              <w:t>7.1</w:t>
-            </w:r>
-          </w:p>
-        </w:tc>
-        <w:tc>
-          <w:tcPr>
-            <w:tcW w:type="dxa" w:w="2160"/>
-          </w:tcPr>
-          <w:p>
-            <w:r>
-              <w:t>11</w:t>
-            </w:r>
-          </w:p>
-        </w:tc>
-      </w:tr>
-      <w:tr>
-        <w:tc>
-          <w:tcPr>
-            <w:tcW w:type="dxa" w:w="2160"/>
-          </w:tcPr>
-          <w:p>
-            <w:r>
-              <w:t>15</w:t>
-            </w:r>
-          </w:p>
-        </w:tc>
-        <w:tc>
-          <w:tcPr>
-            <w:tcW w:type="dxa" w:w="2160"/>
-          </w:tcPr>
-          <w:p>
-            <w:r>
-              <w:t>013 Canalizacion tipo A</w:t>
-            </w:r>
-          </w:p>
-        </w:tc>
-        <w:tc>
-          <w:tcPr>
-            <w:tcW w:type="dxa" w:w="2160"/>
-          </w:tcPr>
-          <w:p>
-            <w:r>
-              <w:t>9.0</w:t>
-            </w:r>
-          </w:p>
-        </w:tc>
-        <w:tc>
-          <w:tcPr>
-            <w:tcW w:type="dxa" w:w="2160"/>
-          </w:tcPr>
-          <w:p>
-            <w:r>
-              <w:t>11</w:t>
-            </w:r>
-          </w:p>
-        </w:tc>
-      </w:tr>
-      <w:tr>
-        <w:tc>
-          <w:tcPr>
-            <w:tcW w:type="dxa" w:w="2160"/>
-          </w:tcPr>
-          <w:p>
-            <w:r>
-              <w:t>16</w:t>
-            </w:r>
-          </w:p>
-        </w:tc>
-        <w:tc>
-          <w:tcPr>
-            <w:tcW w:type="dxa" w:w="2160"/>
-          </w:tcPr>
-          <w:p>
-            <w:r>
-              <w:t>014 Canalizacion tipo A</w:t>
-            </w:r>
-          </w:p>
-        </w:tc>
-        <w:tc>
-          <w:tcPr>
-            <w:tcW w:type="dxa" w:w="2160"/>
-          </w:tcPr>
-          <w:p>
-            <w:r>
-              <w:t>5.1</w:t>
-            </w:r>
-          </w:p>
-        </w:tc>
-        <w:tc>
-          <w:tcPr>
-            <w:tcW w:type="dxa" w:w="2160"/>
-          </w:tcPr>
-          <w:p>
-            <w:r>
-              <w:t>11</w:t>
-            </w:r>
-          </w:p>
-        </w:tc>
-      </w:tr>
-      <w:tr>
-        <w:tc>
-          <w:tcPr>
-            <w:tcW w:type="dxa" w:w="2160"/>
-          </w:tcPr>
-          <w:p>
-            <w:r>
-              <w:t>17</w:t>
-            </w:r>
-          </w:p>
-        </w:tc>
-        <w:tc>
-          <w:tcPr>
-            <w:tcW w:type="dxa" w:w="2160"/>
-          </w:tcPr>
-          <w:p>
-            <w:r>
-              <w:t>015 Canalizacion minicepa</w:t>
-            </w:r>
-          </w:p>
-        </w:tc>
-        <w:tc>
-          <w:tcPr>
-            <w:tcW w:type="dxa" w:w="2160"/>
-          </w:tcPr>
-          <w:p>
-            <w:r>
-              <w:t>1.2</w:t>
-            </w:r>
-          </w:p>
-        </w:tc>
-        <w:tc>
-          <w:tcPr>
-            <w:tcW w:type="dxa" w:w="2160"/>
-          </w:tcPr>
-          <w:p>
-            <w:r>
-              <w:t>10</w:t>
-            </w:r>
-          </w:p>
-        </w:tc>
-      </w:tr>
-      <w:tr>
-        <w:tc>
-          <w:tcPr>
-            <w:tcW w:type="dxa" w:w="2160"/>
-          </w:tcPr>
-          <w:p>
-            <w:r>
-              <w:t>18</w:t>
-            </w:r>
-          </w:p>
-        </w:tc>
-        <w:tc>
-          <w:tcPr>
-            <w:tcW w:type="dxa" w:w="2160"/>
-          </w:tcPr>
-          <w:p>
-            <w:r>
-              <w:t>016 Canalizacion tipo A</w:t>
-            </w:r>
-          </w:p>
-        </w:tc>
-        <w:tc>
-          <w:tcPr>
-            <w:tcW w:type="dxa" w:w="2160"/>
-          </w:tcPr>
-          <w:p>
-            <w:r>
-              <w:t>3.2</w:t>
-            </w:r>
-          </w:p>
-        </w:tc>
-        <w:tc>
-          <w:tcPr>
-            <w:tcW w:type="dxa" w:w="2160"/>
-          </w:tcPr>
-          <w:p>
-            <w:r>
-              <w:t>10</w:t>
-            </w:r>
-          </w:p>
-        </w:tc>
-      </w:tr>
-    </w:tbl>
-    <w:p/>
-    <w:p>
-      <w:r>
-        <w:rPr>
-          <w:b/>
-        </w:rPr>
-        <w:t xml:space="preserve">Total bloque 3: </w:t>
-      </w:r>
-      <w:r>
-        <w:t>50.0 km, 96 min, ~9 baterias</w:t>
-      </w:r>
-    </w:p>
-    <w:p/>
-    <w:p>
-      <w:pPr>
-        <w:pStyle w:val="Heading2"/>
-      </w:pPr>
-      <w:r>
-        <w:t>Bloque 4 - 01 Apr</w:t>
-      </w:r>
-    </w:p>
-    <w:tbl>
-      <w:tblPr>
-        <w:tblStyle w:val="TableGrid"/>
-        <w:tblW w:type="auto" w:w="0"/>
-        <w:tblLook w:firstColumn="1" w:firstRow="1" w:lastColumn="0" w:lastRow="0" w:noHBand="0" w:noVBand="1" w:val="04A0"/>
-      </w:tblPr>
-      <w:tblGrid>
-        <w:gridCol w:w="2160"/>
-        <w:gridCol w:w="2160"/>
-        <w:gridCol w:w="2160"/>
-        <w:gridCol w:w="2160"/>
-      </w:tblGrid>
-      <w:tr>
-        <w:tc>
-          <w:tcPr>
-            <w:tcW w:type="dxa" w:w="2160"/>
-          </w:tcPr>
-          <w:p>
-            <w:r>
-              <w:t>Segmento</w:t>
-            </w:r>
-          </w:p>
-        </w:tc>
-        <w:tc>
-          <w:tcPr>
-            <w:tcW w:type="dxa" w:w="2160"/>
-          </w:tcPr>
-          <w:p>
-            <w:r>
-              <w:t>Nombre</w:t>
-            </w:r>
-          </w:p>
-        </w:tc>
-        <w:tc>
-          <w:tcPr>
-            <w:tcW w:type="dxa" w:w="2160"/>
-          </w:tcPr>
-          <w:p>
-            <w:r>
-              <w:t>km</w:t>
-            </w:r>
-          </w:p>
-        </w:tc>
-        <w:tc>
-          <w:tcPr>
-            <w:tcW w:type="dxa" w:w="2160"/>
-          </w:tcPr>
-          <w:p>
-            <w:r>
-              <w:t>Tiempo min</w:t>
-            </w:r>
-          </w:p>
-        </w:tc>
-      </w:tr>
-      <w:tr>
-        <w:tc>
-          <w:tcPr>
-            <w:tcW w:type="dxa" w:w="2160"/>
-          </w:tcPr>
-          <w:p>
-            <w:r>
-              <w:t>19</w:t>
-            </w:r>
-          </w:p>
-        </w:tc>
-        <w:tc>
-          <w:tcPr>
-            <w:tcW w:type="dxa" w:w="2160"/>
-          </w:tcPr>
-          <w:p>
-            <w:r>
-              <w:t>016 Canalizacion tipo A</w:t>
-            </w:r>
-          </w:p>
-        </w:tc>
-        <w:tc>
-          <w:tcPr>
-            <w:tcW w:type="dxa" w:w="2160"/>
-          </w:tcPr>
-          <w:p>
-            <w:r>
-              <w:t>4.9</w:t>
-            </w:r>
-          </w:p>
-        </w:tc>
-        <w:tc>
-          <w:tcPr>
-            <w:tcW w:type="dxa" w:w="2160"/>
-          </w:tcPr>
-          <w:p>
-            <w:r>
-              <w:t>11</w:t>
-            </w:r>
-          </w:p>
-        </w:tc>
-      </w:tr>
-      <w:tr>
-        <w:tc>
-          <w:tcPr>
-            <w:tcW w:type="dxa" w:w="2160"/>
-          </w:tcPr>
-          <w:p>
-            <w:r>
-              <w:t>20</w:t>
-            </w:r>
-          </w:p>
-        </w:tc>
-        <w:tc>
-          <w:tcPr>
-            <w:tcW w:type="dxa" w:w="2160"/>
-          </w:tcPr>
-          <w:p>
-            <w:r>
-              <w:t>017 Canalizacion tipo A</w:t>
-            </w:r>
-          </w:p>
-        </w:tc>
-        <w:tc>
-          <w:tcPr>
-            <w:tcW w:type="dxa" w:w="2160"/>
-          </w:tcPr>
-          <w:p>
-            <w:r>
-              <w:t>7.2</w:t>
-            </w:r>
-          </w:p>
-        </w:tc>
-        <w:tc>
-          <w:tcPr>
-            <w:tcW w:type="dxa" w:w="2160"/>
-          </w:tcPr>
-          <w:p>
-            <w:r>
-              <w:t>11</w:t>
-            </w:r>
-          </w:p>
-        </w:tc>
-      </w:tr>
-      <w:tr>
-        <w:tc>
-          <w:tcPr>
-            <w:tcW w:type="dxa" w:w="2160"/>
-          </w:tcPr>
-          <w:p>
-            <w:r>
-              <w:t>21</w:t>
-            </w:r>
-          </w:p>
-        </w:tc>
-        <w:tc>
-          <w:tcPr>
-            <w:tcW w:type="dxa" w:w="2160"/>
-          </w:tcPr>
-          <w:p>
-            <w:r>
-              <w:t>018 Canalizacion Piedra bola</w:t>
-            </w:r>
-          </w:p>
-        </w:tc>
-        <w:tc>
-          <w:tcPr>
-            <w:tcW w:type="dxa" w:w="2160"/>
-          </w:tcPr>
-          <w:p>
-            <w:r>
-              <w:t>37.8</w:t>
-            </w:r>
-          </w:p>
-        </w:tc>
-        <w:tc>
-          <w:tcPr>
-            <w:tcW w:type="dxa" w:w="2160"/>
-          </w:tcPr>
-          <w:p>
-            <w:r>
-              <w:t>14</w:t>
-            </w:r>
-          </w:p>
-        </w:tc>
-      </w:tr>
-    </w:tbl>
-    <w:p/>
-    <w:p>
-      <w:r>
-        <w:rPr>
-          <w:b/>
-        </w:rPr>
-        <w:t xml:space="preserve">Total bloque 4: </w:t>
-      </w:r>
-      <w:r>
-        <w:t>50.0 km, 36 min, ~3 baterias</w:t>
-      </w:r>
-    </w:p>
-    <w:p/>
-    <w:p>
-      <w:pPr>
-        <w:pStyle w:val="Heading2"/>
-      </w:pPr>
-      <w:r>
-        <w:t>Bloque 5 - 02 Apr</w:t>
-      </w:r>
-    </w:p>
-    <w:tbl>
-      <w:tblPr>
-        <w:tblStyle w:val="TableGrid"/>
-        <w:tblW w:type="auto" w:w="0"/>
-        <w:tblLook w:firstColumn="1" w:firstRow="1" w:lastColumn="0" w:lastRow="0" w:noHBand="0" w:noVBand="1" w:val="04A0"/>
-      </w:tblPr>
-      <w:tblGrid>
-        <w:gridCol w:w="2160"/>
-        <w:gridCol w:w="2160"/>
-        <w:gridCol w:w="2160"/>
-        <w:gridCol w:w="2160"/>
-      </w:tblGrid>
-      <w:tr>
-        <w:tc>
-          <w:tcPr>
-            <w:tcW w:type="dxa" w:w="2160"/>
-          </w:tcPr>
-          <w:p>
-            <w:r>
-              <w:t>Segmento</w:t>
-            </w:r>
-          </w:p>
-        </w:tc>
-        <w:tc>
-          <w:tcPr>
-            <w:tcW w:type="dxa" w:w="2160"/>
-          </w:tcPr>
-          <w:p>
-            <w:r>
-              <w:t>Nombre</w:t>
-            </w:r>
-          </w:p>
-        </w:tc>
-        <w:tc>
-          <w:tcPr>
-            <w:tcW w:type="dxa" w:w="2160"/>
-          </w:tcPr>
-          <w:p>
-            <w:r>
-              <w:t>km</w:t>
-            </w:r>
-          </w:p>
-        </w:tc>
-        <w:tc>
-          <w:tcPr>
-            <w:tcW w:type="dxa" w:w="2160"/>
-          </w:tcPr>
-          <w:p>
-            <w:r>
-              <w:t>Tiempo min</w:t>
-            </w:r>
-          </w:p>
-        </w:tc>
-      </w:tr>
-      <w:tr>
-        <w:tc>
-          <w:tcPr>
-            <w:tcW w:type="dxa" w:w="2160"/>
-          </w:tcPr>
-          <w:p>
-            <w:r>
-              <w:t>22</w:t>
-            </w:r>
-          </w:p>
-        </w:tc>
-        <w:tc>
-          <w:tcPr>
-            <w:tcW w:type="dxa" w:w="2160"/>
-          </w:tcPr>
-          <w:p>
-            <w:r>
-              <w:t>018 Canalizacion Piedra bola</w:t>
-            </w:r>
-          </w:p>
-        </w:tc>
-        <w:tc>
-          <w:tcPr>
-            <w:tcW w:type="dxa" w:w="2160"/>
-          </w:tcPr>
-          <w:p>
-            <w:r>
-              <w:t>37.6</w:t>
-            </w:r>
-          </w:p>
-        </w:tc>
-        <w:tc>
-          <w:tcPr>
-            <w:tcW w:type="dxa" w:w="2160"/>
-          </w:tcPr>
-          <w:p>
-            <w:r>
-              <w:t>14</w:t>
-            </w:r>
-          </w:p>
-        </w:tc>
-      </w:tr>
-      <w:tr>
-        <w:tc>
-          <w:tcPr>
-            <w:tcW w:type="dxa" w:w="2160"/>
-          </w:tcPr>
-          <w:p>
-            <w:r>
-              <w:t>23</w:t>
-            </w:r>
-          </w:p>
-        </w:tc>
-        <w:tc>
-          <w:tcPr>
-            <w:tcW w:type="dxa" w:w="2160"/>
-          </w:tcPr>
-          <w:p>
-            <w:r>
-              <w:t>019 Canalizacion Piedra bola</w:t>
-            </w:r>
-          </w:p>
-        </w:tc>
-        <w:tc>
-          <w:tcPr>
-            <w:tcW w:type="dxa" w:w="2160"/>
-          </w:tcPr>
-          <w:p>
-            <w:r>
-              <w:t>3.1</w:t>
-            </w:r>
-          </w:p>
-        </w:tc>
-        <w:tc>
-          <w:tcPr>
-            <w:tcW w:type="dxa" w:w="2160"/>
-          </w:tcPr>
-          <w:p>
-            <w:r>
-              <w:t>10</w:t>
-            </w:r>
-          </w:p>
-        </w:tc>
-      </w:tr>
-      <w:tr>
-        <w:tc>
-          <w:tcPr>
-            <w:tcW w:type="dxa" w:w="2160"/>
-          </w:tcPr>
-          <w:p>
-            <w:r>
-              <w:t>24</w:t>
-            </w:r>
-          </w:p>
-        </w:tc>
-        <w:tc>
-          <w:tcPr>
-            <w:tcW w:type="dxa" w:w="2160"/>
-          </w:tcPr>
-          <w:p>
-            <w:r>
-              <w:t>020 Canalizacion minicepa</w:t>
-            </w:r>
-          </w:p>
-        </w:tc>
-        <w:tc>
-          <w:tcPr>
-            <w:tcW w:type="dxa" w:w="2160"/>
-          </w:tcPr>
-          <w:p>
-            <w:r>
-              <w:t>2.0</w:t>
-            </w:r>
-          </w:p>
-        </w:tc>
-        <w:tc>
-          <w:tcPr>
-            <w:tcW w:type="dxa" w:w="2160"/>
-          </w:tcPr>
-          <w:p>
-            <w:r>
-              <w:t>10</w:t>
-            </w:r>
-          </w:p>
-        </w:tc>
-      </w:tr>
-      <w:tr>
-        <w:tc>
-          <w:tcPr>
-            <w:tcW w:type="dxa" w:w="2160"/>
-          </w:tcPr>
-          <w:p>
-            <w:r>
-              <w:t>25</w:t>
-            </w:r>
-          </w:p>
-        </w:tc>
-        <w:tc>
-          <w:tcPr>
-            <w:tcW w:type="dxa" w:w="2160"/>
-          </w:tcPr>
-          <w:p>
-            <w:r>
-              <w:t>021 Canalizacion minicepa</w:t>
-            </w:r>
-          </w:p>
-        </w:tc>
-        <w:tc>
-          <w:tcPr>
-            <w:tcW w:type="dxa" w:w="2160"/>
-          </w:tcPr>
-          <w:p>
-            <w:r>
-              <w:t>7.3</w:t>
-            </w:r>
-          </w:p>
-        </w:tc>
-        <w:tc>
-          <w:tcPr>
-            <w:tcW w:type="dxa" w:w="2160"/>
-          </w:tcPr>
-          <w:p>
-            <w:r>
-              <w:t>11</w:t>
-            </w:r>
-          </w:p>
-        </w:tc>
-      </w:tr>
-    </w:tbl>
-    <w:p/>
-    <w:p>
-      <w:r>
-        <w:rPr>
-          <w:b/>
-        </w:rPr>
-        <w:t xml:space="preserve">Total bloque 5: </w:t>
-      </w:r>
-      <w:r>
-        <w:t>50.0 km, 46 min, ~4 baterias</w:t>
-      </w:r>
-    </w:p>
-    <w:p/>
-    <w:p>
-      <w:pPr>
-        <w:pStyle w:val="Heading2"/>
-      </w:pPr>
-      <w:r>
-        <w:t>Bloque 6 - 02 Apr</w:t>
-      </w:r>
-    </w:p>
-    <w:tbl>
-      <w:tblPr>
-        <w:tblStyle w:val="TableGrid"/>
-        <w:tblW w:type="auto" w:w="0"/>
-        <w:tblLook w:firstColumn="1" w:firstRow="1" w:lastColumn="0" w:lastRow="0" w:noHBand="0" w:noVBand="1" w:val="04A0"/>
-      </w:tblPr>
-      <w:tblGrid>
-        <w:gridCol w:w="2160"/>
-        <w:gridCol w:w="2160"/>
-        <w:gridCol w:w="2160"/>
-        <w:gridCol w:w="2160"/>
-      </w:tblGrid>
-      <w:tr>
-        <w:tc>
-          <w:tcPr>
-            <w:tcW w:type="dxa" w:w="2160"/>
-          </w:tcPr>
-          <w:p>
-            <w:r>
-              <w:t>Segmento</w:t>
-            </w:r>
-          </w:p>
-        </w:tc>
-        <w:tc>
-          <w:tcPr>
-            <w:tcW w:type="dxa" w:w="2160"/>
-          </w:tcPr>
-          <w:p>
-            <w:r>
-              <w:t>Nombre</w:t>
-            </w:r>
-          </w:p>
-        </w:tc>
-        <w:tc>
-          <w:tcPr>
-            <w:tcW w:type="dxa" w:w="2160"/>
-          </w:tcPr>
-          <w:p>
-            <w:r>
-              <w:t>km</w:t>
-            </w:r>
-          </w:p>
-        </w:tc>
-        <w:tc>
-          <w:tcPr>
-            <w:tcW w:type="dxa" w:w="2160"/>
-          </w:tcPr>
-          <w:p>
-            <w:r>
-              <w:t>Tiempo min</w:t>
-            </w:r>
-          </w:p>
-        </w:tc>
-      </w:tr>
-      <w:tr>
-        <w:tc>
-          <w:tcPr>
-            <w:tcW w:type="dxa" w:w="2160"/>
-          </w:tcPr>
-          <w:p>
-            <w:r>
-              <w:t>26</w:t>
-            </w:r>
-          </w:p>
-        </w:tc>
-        <w:tc>
-          <w:tcPr>
-            <w:tcW w:type="dxa" w:w="2160"/>
-          </w:tcPr>
-          <w:p>
-            <w:r>
-              <w:t>021 Canalizacion minicepa</w:t>
-            </w:r>
-          </w:p>
-        </w:tc>
-        <w:tc>
-          <w:tcPr>
-            <w:tcW w:type="dxa" w:w="2160"/>
-          </w:tcPr>
-          <w:p>
-            <w:r>
-              <w:t>8.1</w:t>
-            </w:r>
-          </w:p>
-        </w:tc>
-        <w:tc>
-          <w:tcPr>
-            <w:tcW w:type="dxa" w:w="2160"/>
-          </w:tcPr>
-          <w:p>
-            <w:r>
-              <w:t>11</w:t>
-            </w:r>
-          </w:p>
-        </w:tc>
-      </w:tr>
-      <w:tr>
-        <w:tc>
-          <w:tcPr>
-            <w:tcW w:type="dxa" w:w="2160"/>
-          </w:tcPr>
-          <w:p>
-            <w:r>
-              <w:t>27</w:t>
-            </w:r>
-          </w:p>
-        </w:tc>
-        <w:tc>
-          <w:tcPr>
-            <w:tcW w:type="dxa" w:w="2160"/>
-          </w:tcPr>
-          <w:p>
-            <w:r>
-              <w:t>022 Canalizacion Piedra bola</w:t>
-            </w:r>
-          </w:p>
-        </w:tc>
-        <w:tc>
-          <w:tcPr>
-            <w:tcW w:type="dxa" w:w="2160"/>
-          </w:tcPr>
-          <w:p>
-            <w:r>
-              <w:t>8.4</w:t>
-            </w:r>
-          </w:p>
-        </w:tc>
-        <w:tc>
-          <w:tcPr>
-            <w:tcW w:type="dxa" w:w="2160"/>
-          </w:tcPr>
-          <w:p>
-            <w:r>
-              <w:t>11</w:t>
-            </w:r>
-          </w:p>
-        </w:tc>
-      </w:tr>
-      <w:tr>
-        <w:tc>
-          <w:tcPr>
-            <w:tcW w:type="dxa" w:w="2160"/>
-          </w:tcPr>
-          <w:p>
-            <w:r>
-              <w:t>28</w:t>
-            </w:r>
-          </w:p>
-        </w:tc>
-        <w:tc>
-          <w:tcPr>
-            <w:tcW w:type="dxa" w:w="2160"/>
-          </w:tcPr>
-          <w:p>
-            <w:r>
-              <w:t>023 Canalizacion Piedra bola</w:t>
-            </w:r>
-          </w:p>
-        </w:tc>
-        <w:tc>
-          <w:tcPr>
-            <w:tcW w:type="dxa" w:w="2160"/>
-          </w:tcPr>
-          <w:p>
-            <w:r>
-              <w:t>12.5</w:t>
-            </w:r>
-          </w:p>
-        </w:tc>
-        <w:tc>
-          <w:tcPr>
-            <w:tcW w:type="dxa" w:w="2160"/>
-          </w:tcPr>
-          <w:p>
-            <w:r>
-              <w:t>11</w:t>
-            </w:r>
-          </w:p>
-        </w:tc>
-      </w:tr>
-      <w:tr>
-        <w:tc>
-          <w:tcPr>
-            <w:tcW w:type="dxa" w:w="2160"/>
-          </w:tcPr>
-          <w:p>
-            <w:r>
-              <w:t>29</w:t>
-            </w:r>
-          </w:p>
-        </w:tc>
-        <w:tc>
-          <w:tcPr>
-            <w:tcW w:type="dxa" w:w="2160"/>
-          </w:tcPr>
-          <w:p>
-            <w:r>
-              <w:t>024 Canalizacion minicepa</w:t>
-            </w:r>
-          </w:p>
-        </w:tc>
-        <w:tc>
-          <w:tcPr>
-            <w:tcW w:type="dxa" w:w="2160"/>
-          </w:tcPr>
-          <w:p>
-            <w:r>
-              <w:t>10.6</w:t>
-            </w:r>
-          </w:p>
-        </w:tc>
-        <w:tc>
-          <w:tcPr>
-            <w:tcW w:type="dxa" w:w="2160"/>
-          </w:tcPr>
-          <w:p>
-            <w:r>
-              <w:t>11</w:t>
-            </w:r>
-          </w:p>
-        </w:tc>
-      </w:tr>
-      <w:tr>
-        <w:tc>
-          <w:tcPr>
-            <w:tcW w:type="dxa" w:w="2160"/>
-          </w:tcPr>
-          <w:p>
-            <w:r>
-              <w:t>30</w:t>
-            </w:r>
-          </w:p>
-        </w:tc>
-        <w:tc>
-          <w:tcPr>
-            <w:tcW w:type="dxa" w:w="2160"/>
-          </w:tcPr>
-          <w:p>
-            <w:r>
-              <w:t>025 Canalizacion Piedra bola</w:t>
-            </w:r>
-          </w:p>
-        </w:tc>
-        <w:tc>
-          <w:tcPr>
-            <w:tcW w:type="dxa" w:w="2160"/>
-          </w:tcPr>
-          <w:p>
-            <w:r>
-              <w:t>8.0</w:t>
-            </w:r>
-          </w:p>
-        </w:tc>
-        <w:tc>
-          <w:tcPr>
-            <w:tcW w:type="dxa" w:w="2160"/>
-          </w:tcPr>
-          <w:p>
-            <w:r>
-              <w:t>11</w:t>
-            </w:r>
-          </w:p>
-        </w:tc>
-      </w:tr>
-      <w:tr>
-        <w:tc>
-          <w:tcPr>
-            <w:tcW w:type="dxa" w:w="2160"/>
-          </w:tcPr>
-          <w:p>
-            <w:r>
-              <w:t>31</w:t>
-            </w:r>
-          </w:p>
-        </w:tc>
-        <w:tc>
-          <w:tcPr>
-            <w:tcW w:type="dxa" w:w="2160"/>
-          </w:tcPr>
-          <w:p>
-            <w:r>
-              <w:t>026 Canalizacion minicepa</w:t>
-            </w:r>
-          </w:p>
-        </w:tc>
-        <w:tc>
-          <w:tcPr>
-            <w:tcW w:type="dxa" w:w="2160"/>
-          </w:tcPr>
-          <w:p>
-            <w:r>
-              <w:t>1.1</w:t>
-            </w:r>
-          </w:p>
-        </w:tc>
-        <w:tc>
-          <w:tcPr>
-            <w:tcW w:type="dxa" w:w="2160"/>
-          </w:tcPr>
-          <w:p>
-            <w:r>
-              <w:t>10</w:t>
-            </w:r>
-          </w:p>
-        </w:tc>
-      </w:tr>
-      <w:tr>
-        <w:tc>
-          <w:tcPr>
-            <w:tcW w:type="dxa" w:w="2160"/>
-          </w:tcPr>
-          <w:p>
-            <w:r>
-              <w:t>32</w:t>
-            </w:r>
-          </w:p>
-        </w:tc>
-        <w:tc>
-          <w:tcPr>
-            <w:tcW w:type="dxa" w:w="2160"/>
-          </w:tcPr>
-          <w:p>
-            <w:r>
-              <w:t>027 Canalizacion Piedra bola</w:t>
-            </w:r>
-          </w:p>
-        </w:tc>
-        <w:tc>
-          <w:tcPr>
-            <w:tcW w:type="dxa" w:w="2160"/>
-          </w:tcPr>
-          <w:p>
-            <w:r>
-              <w:t>1.3</w:t>
-            </w:r>
-          </w:p>
-        </w:tc>
-        <w:tc>
-          <w:tcPr>
-            <w:tcW w:type="dxa" w:w="2160"/>
-          </w:tcPr>
-          <w:p>
-            <w:r>
-              <w:t>10</w:t>
-            </w:r>
-          </w:p>
-        </w:tc>
-      </w:tr>
-    </w:tbl>
-    <w:p/>
-    <w:p>
-      <w:r>
-        <w:rPr>
-          <w:b/>
-        </w:rPr>
-        <w:t xml:space="preserve">Total bloque 6: </w:t>
-      </w:r>
-      <w:r>
-        <w:t>50.0 km, 76 min, ~7 baterias</w:t>
-      </w:r>
-    </w:p>
-    <w:p/>
-    <w:p>
-      <w:pPr>
-        <w:pStyle w:val="Heading2"/>
-      </w:pPr>
-      <w:r>
-        <w:t>Bloque 7 - 02 Apr</w:t>
-      </w:r>
-    </w:p>
-    <w:tbl>
-      <w:tblPr>
-        <w:tblStyle w:val="TableGrid"/>
-        <w:tblW w:type="auto" w:w="0"/>
-        <w:tblLook w:firstColumn="1" w:firstRow="1" w:lastColumn="0" w:lastRow="0" w:noHBand="0" w:noVBand="1" w:val="04A0"/>
-      </w:tblPr>
-      <w:tblGrid>
-        <w:gridCol w:w="2160"/>
-        <w:gridCol w:w="2160"/>
-        <w:gridCol w:w="2160"/>
-        <w:gridCol w:w="2160"/>
-      </w:tblGrid>
-      <w:tr>
-        <w:tc>
-          <w:tcPr>
-            <w:tcW w:type="dxa" w:w="2160"/>
-          </w:tcPr>
-          <w:p>
-            <w:r>
-              <w:t>Segmento</w:t>
-            </w:r>
-          </w:p>
-        </w:tc>
-        <w:tc>
-          <w:tcPr>
-            <w:tcW w:type="dxa" w:w="2160"/>
-          </w:tcPr>
-          <w:p>
-            <w:r>
-              <w:t>Nombre</w:t>
-            </w:r>
-          </w:p>
-        </w:tc>
-        <w:tc>
-          <w:tcPr>
-            <w:tcW w:type="dxa" w:w="2160"/>
-          </w:tcPr>
-          <w:p>
-            <w:r>
-              <w:t>km</w:t>
-            </w:r>
-          </w:p>
-        </w:tc>
-        <w:tc>
-          <w:tcPr>
-            <w:tcW w:type="dxa" w:w="2160"/>
-          </w:tcPr>
-          <w:p>
-            <w:r>
-              <w:t>Tiempo min</w:t>
-            </w:r>
-          </w:p>
-        </w:tc>
-      </w:tr>
-      <w:tr>
-        <w:tc>
-          <w:tcPr>
-            <w:tcW w:type="dxa" w:w="2160"/>
-          </w:tcPr>
-          <w:p>
-            <w:r>
-              <w:t>33</w:t>
-            </w:r>
-          </w:p>
-        </w:tc>
-        <w:tc>
-          <w:tcPr>
-            <w:tcW w:type="dxa" w:w="2160"/>
-          </w:tcPr>
-          <w:p>
-            <w:r>
-              <w:t>027 Canalizacion Piedra bola</w:t>
-            </w:r>
-          </w:p>
-        </w:tc>
-        <w:tc>
-          <w:tcPr>
-            <w:tcW w:type="dxa" w:w="2160"/>
-          </w:tcPr>
-          <w:p>
-            <w:r>
-              <w:t>28.5</w:t>
-            </w:r>
-          </w:p>
-        </w:tc>
-        <w:tc>
-          <w:tcPr>
-            <w:tcW w:type="dxa" w:w="2160"/>
-          </w:tcPr>
-          <w:p>
-            <w:r>
-              <w:t>13</w:t>
-            </w:r>
-          </w:p>
-        </w:tc>
-      </w:tr>
-      <w:tr>
-        <w:tc>
-          <w:tcPr>
-            <w:tcW w:type="dxa" w:w="2160"/>
-          </w:tcPr>
-          <w:p>
-            <w:r>
-              <w:t>34</w:t>
-            </w:r>
-          </w:p>
-        </w:tc>
-        <w:tc>
-          <w:tcPr>
-            <w:tcW w:type="dxa" w:w="2160"/>
-          </w:tcPr>
-          <w:p>
-            <w:r>
-              <w:t>028 Canalizacion tipo A</w:t>
-            </w:r>
-          </w:p>
-        </w:tc>
-        <w:tc>
-          <w:tcPr>
-            <w:tcW w:type="dxa" w:w="2160"/>
-          </w:tcPr>
-          <w:p>
-            <w:r>
-              <w:t>10.0</w:t>
-            </w:r>
-          </w:p>
-        </w:tc>
-        <w:tc>
-          <w:tcPr>
-            <w:tcW w:type="dxa" w:w="2160"/>
-          </w:tcPr>
-          <w:p>
-            <w:r>
-              <w:t>11</w:t>
-            </w:r>
-          </w:p>
-        </w:tc>
-      </w:tr>
-      <w:tr>
-        <w:tc>
-          <w:tcPr>
-            <w:tcW w:type="dxa" w:w="2160"/>
-          </w:tcPr>
-          <w:p>
-            <w:r>
-              <w:t>35</w:t>
-            </w:r>
-          </w:p>
-        </w:tc>
-        <w:tc>
-          <w:tcPr>
-            <w:tcW w:type="dxa" w:w="2160"/>
-          </w:tcPr>
-          <w:p>
-            <w:r>
-              <w:t>030 Canalizacion tipo A</w:t>
-            </w:r>
-          </w:p>
-        </w:tc>
-        <w:tc>
-          <w:tcPr>
-            <w:tcW w:type="dxa" w:w="2160"/>
-          </w:tcPr>
-          <w:p>
-            <w:r>
-              <w:t>2.0</w:t>
-            </w:r>
-          </w:p>
-        </w:tc>
-        <w:tc>
-          <w:tcPr>
-            <w:tcW w:type="dxa" w:w="2160"/>
-          </w:tcPr>
-          <w:p>
-            <w:r>
-              <w:t>10</w:t>
-            </w:r>
-          </w:p>
-        </w:tc>
-      </w:tr>
-      <w:tr>
-        <w:tc>
-          <w:tcPr>
-            <w:tcW w:type="dxa" w:w="2160"/>
-          </w:tcPr>
-          <w:p>
-            <w:r>
-              <w:t>36</w:t>
-            </w:r>
-          </w:p>
-        </w:tc>
-        <w:tc>
-          <w:tcPr>
-            <w:tcW w:type="dxa" w:w="2160"/>
-          </w:tcPr>
-          <w:p>
-            <w:r>
-              <w:t>031 Canalizado Piedra bola</w:t>
-            </w:r>
-          </w:p>
-        </w:tc>
-        <w:tc>
-          <w:tcPr>
-            <w:tcW w:type="dxa" w:w="2160"/>
-          </w:tcPr>
-          <w:p>
-            <w:r>
-              <w:t>9.4</w:t>
-            </w:r>
-          </w:p>
-        </w:tc>
-        <w:tc>
-          <w:tcPr>
-            <w:tcW w:type="dxa" w:w="2160"/>
-          </w:tcPr>
-          <w:p>
-            <w:r>
-              <w:t>11</w:t>
-            </w:r>
-          </w:p>
-        </w:tc>
-      </w:tr>
-    </w:tbl>
-    <w:p/>
-    <w:p>
-      <w:r>
-        <w:rPr>
-          <w:b/>
-        </w:rPr>
-        <w:t xml:space="preserve">Total bloque 7: </w:t>
-      </w:r>
-      <w:r>
-        <w:t>50.0 km, 46 min, ~4 baterias</w:t>
-      </w:r>
-    </w:p>
-    <w:p/>
-    <w:p>
-      <w:pPr>
-        <w:pStyle w:val="Heading2"/>
-      </w:pPr>
-      <w:r>
-        <w:t>Bloque 8 - 02 Apr</w:t>
-      </w:r>
-    </w:p>
-    <w:tbl>
-      <w:tblPr>
-        <w:tblStyle w:val="TableGrid"/>
-        <w:tblW w:type="auto" w:w="0"/>
-        <w:tblLook w:firstColumn="1" w:firstRow="1" w:lastColumn="0" w:lastRow="0" w:noHBand="0" w:noVBand="1" w:val="04A0"/>
-      </w:tblPr>
-      <w:tblGrid>
-        <w:gridCol w:w="2160"/>
-        <w:gridCol w:w="2160"/>
-        <w:gridCol w:w="2160"/>
-        <w:gridCol w:w="2160"/>
-      </w:tblGrid>
-      <w:tr>
-        <w:tc>
-          <w:tcPr>
-            <w:tcW w:type="dxa" w:w="2160"/>
-          </w:tcPr>
-          <w:p>
-            <w:r>
-              <w:t>Segmento</w:t>
-            </w:r>
-          </w:p>
-        </w:tc>
-        <w:tc>
-          <w:tcPr>
-            <w:tcW w:type="dxa" w:w="2160"/>
-          </w:tcPr>
-          <w:p>
-            <w:r>
-              <w:t>Nombre</w:t>
-            </w:r>
-          </w:p>
-        </w:tc>
-        <w:tc>
-          <w:tcPr>
-            <w:tcW w:type="dxa" w:w="2160"/>
-          </w:tcPr>
-          <w:p>
-            <w:r>
-              <w:t>km</w:t>
-            </w:r>
-          </w:p>
-        </w:tc>
-        <w:tc>
-          <w:tcPr>
-            <w:tcW w:type="dxa" w:w="2160"/>
-          </w:tcPr>
-          <w:p>
-            <w:r>
-              <w:t>Tiempo min</w:t>
-            </w:r>
-          </w:p>
-        </w:tc>
-      </w:tr>
-      <w:tr>
-        <w:tc>
-          <w:tcPr>
-            <w:tcW w:type="dxa" w:w="2160"/>
-          </w:tcPr>
-          <w:p>
-            <w:r>
-              <w:t>37</w:t>
-            </w:r>
-          </w:p>
-        </w:tc>
-        <w:tc>
-          <w:tcPr>
-            <w:tcW w:type="dxa" w:w="2160"/>
-          </w:tcPr>
-          <w:p>
-            <w:r>
-              <w:t>031 Canalizado Piedra bola</w:t>
-            </w:r>
-          </w:p>
-        </w:tc>
-        <w:tc>
-          <w:tcPr>
-            <w:tcW w:type="dxa" w:w="2160"/>
-          </w:tcPr>
-          <w:p>
-            <w:r>
-              <w:t>30.4</w:t>
-            </w:r>
-          </w:p>
-        </w:tc>
-        <w:tc>
-          <w:tcPr>
-            <w:tcW w:type="dxa" w:w="2160"/>
-          </w:tcPr>
-          <w:p>
-            <w:r>
-              <w:t>14</w:t>
-            </w:r>
-          </w:p>
-        </w:tc>
-      </w:tr>
-      <w:tr>
-        <w:tc>
-          <w:tcPr>
-            <w:tcW w:type="dxa" w:w="2160"/>
-          </w:tcPr>
-          <w:p>
-            <w:r>
-              <w:t>38</w:t>
-            </w:r>
-          </w:p>
-        </w:tc>
-        <w:tc>
-          <w:tcPr>
-            <w:tcW w:type="dxa" w:w="2160"/>
-          </w:tcPr>
-          <w:p>
-            <w:r>
-              <w:t>032 Canalizacion tipo A</w:t>
-            </w:r>
-          </w:p>
-        </w:tc>
-        <w:tc>
-          <w:tcPr>
-            <w:tcW w:type="dxa" w:w="2160"/>
-          </w:tcPr>
-          <w:p>
-            <w:r>
-              <w:t>16.2</w:t>
-            </w:r>
-          </w:p>
-        </w:tc>
-        <w:tc>
-          <w:tcPr>
-            <w:tcW w:type="dxa" w:w="2160"/>
-          </w:tcPr>
-          <w:p>
-            <w:r>
-              <w:t>12</w:t>
-            </w:r>
-          </w:p>
-        </w:tc>
-      </w:tr>
-      <w:tr>
-        <w:tc>
-          <w:tcPr>
-            <w:tcW w:type="dxa" w:w="2160"/>
-          </w:tcPr>
-          <w:p>
-            <w:r>
-              <w:t>39</w:t>
-            </w:r>
-          </w:p>
-        </w:tc>
-        <w:tc>
-          <w:tcPr>
-            <w:tcW w:type="dxa" w:w="2160"/>
-          </w:tcPr>
-          <w:p>
-            <w:r>
-              <w:t>033 Canalizacion minicepa</w:t>
-            </w:r>
-          </w:p>
-        </w:tc>
-        <w:tc>
-          <w:tcPr>
-            <w:tcW w:type="dxa" w:w="2160"/>
-          </w:tcPr>
-          <w:p>
-            <w:r>
-              <w:t>3.4</w:t>
-            </w:r>
-          </w:p>
-        </w:tc>
-        <w:tc>
-          <w:tcPr>
-            <w:tcW w:type="dxa" w:w="2160"/>
-          </w:tcPr>
-          <w:p>
-            <w:r>
-              <w:t>10</w:t>
-            </w:r>
-          </w:p>
-        </w:tc>
-      </w:tr>
-    </w:tbl>
-    <w:p/>
-    <w:p>
-      <w:r>
-        <w:rPr>
-          <w:b/>
-        </w:rPr>
-        <w:t xml:space="preserve">Total bloque 8: </w:t>
-      </w:r>
-      <w:r>
-        <w:t>50.0 km, 36 min, ~3 baterias</w:t>
-      </w:r>
-    </w:p>
-    <w:p/>
-    <w:p>
-      <w:pPr>
-        <w:pStyle w:val="Heading2"/>
-      </w:pPr>
-      <w:r>
-        <w:t>Bloque 9 - 03 Apr</w:t>
-      </w:r>
-    </w:p>
-    <w:tbl>
-      <w:tblPr>
-        <w:tblStyle w:val="TableGrid"/>
-        <w:tblW w:type="auto" w:w="0"/>
-        <w:tblLook w:firstColumn="1" w:firstRow="1" w:lastColumn="0" w:lastRow="0" w:noHBand="0" w:noVBand="1" w:val="04A0"/>
-      </w:tblPr>
-      <w:tblGrid>
-        <w:gridCol w:w="2160"/>
-        <w:gridCol w:w="2160"/>
-        <w:gridCol w:w="2160"/>
-        <w:gridCol w:w="2160"/>
-      </w:tblGrid>
-      <w:tr>
-        <w:tc>
-          <w:tcPr>
-            <w:tcW w:type="dxa" w:w="2160"/>
-          </w:tcPr>
-          <w:p>
-            <w:r>
-              <w:t>Segmento</w:t>
-            </w:r>
-          </w:p>
-        </w:tc>
-        <w:tc>
-          <w:tcPr>
-            <w:tcW w:type="dxa" w:w="2160"/>
-          </w:tcPr>
-          <w:p>
-            <w:r>
-              <w:t>Nombre</w:t>
-            </w:r>
-          </w:p>
-        </w:tc>
-        <w:tc>
-          <w:tcPr>
-            <w:tcW w:type="dxa" w:w="2160"/>
-          </w:tcPr>
-          <w:p>
-            <w:r>
-              <w:t>km</w:t>
-            </w:r>
-          </w:p>
-        </w:tc>
-        <w:tc>
-          <w:tcPr>
-            <w:tcW w:type="dxa" w:w="2160"/>
-          </w:tcPr>
-          <w:p>
-            <w:r>
-              <w:t>Tiempo min</w:t>
-            </w:r>
-          </w:p>
-        </w:tc>
-      </w:tr>
-      <w:tr>
-        <w:tc>
-          <w:tcPr>
-            <w:tcW w:type="dxa" w:w="2160"/>
-          </w:tcPr>
-          <w:p>
-            <w:r>
-              <w:t>40</w:t>
-            </w:r>
-          </w:p>
-        </w:tc>
-        <w:tc>
-          <w:tcPr>
-            <w:tcW w:type="dxa" w:w="2160"/>
-          </w:tcPr>
-          <w:p>
-            <w:r>
-              <w:t>033 Canalizacion minicepa</w:t>
-            </w:r>
-          </w:p>
-        </w:tc>
-        <w:tc>
-          <w:tcPr>
-            <w:tcW w:type="dxa" w:w="2160"/>
-          </w:tcPr>
-          <w:p>
-            <w:r>
-              <w:t>11.1</w:t>
-            </w:r>
-          </w:p>
-        </w:tc>
-        <w:tc>
-          <w:tcPr>
-            <w:tcW w:type="dxa" w:w="2160"/>
-          </w:tcPr>
-          <w:p>
-            <w:r>
-              <w:t>11</w:t>
-            </w:r>
-          </w:p>
-        </w:tc>
-      </w:tr>
-      <w:tr>
-        <w:tc>
-          <w:tcPr>
-            <w:tcW w:type="dxa" w:w="2160"/>
-          </w:tcPr>
-          <w:p>
-            <w:r>
-              <w:t>41</w:t>
-            </w:r>
-          </w:p>
-        </w:tc>
-        <w:tc>
-          <w:tcPr>
-            <w:tcW w:type="dxa" w:w="2160"/>
-          </w:tcPr>
-          <w:p>
-            <w:r>
-              <w:t>029 Canalizacion minicepa</w:t>
-            </w:r>
-          </w:p>
-        </w:tc>
-        <w:tc>
-          <w:tcPr>
-            <w:tcW w:type="dxa" w:w="2160"/>
-          </w:tcPr>
-          <w:p>
-            <w:r>
-              <w:t>0.5</w:t>
-            </w:r>
-          </w:p>
-        </w:tc>
-        <w:tc>
-          <w:tcPr>
-            <w:tcW w:type="dxa" w:w="2160"/>
-          </w:tcPr>
-          <w:p>
-            <w:r>
-              <w:t>10</w:t>
-            </w:r>
-          </w:p>
-        </w:tc>
-      </w:tr>
-      <w:tr>
-        <w:tc>
-          <w:tcPr>
-            <w:tcW w:type="dxa" w:w="2160"/>
-          </w:tcPr>
-          <w:p>
-            <w:r>
-              <w:t>42</w:t>
-            </w:r>
-          </w:p>
-        </w:tc>
-        <w:tc>
-          <w:tcPr>
-            <w:tcW w:type="dxa" w:w="2160"/>
-          </w:tcPr>
-          <w:p>
-            <w:r>
-              <w:t>Adosado</w:t>
-            </w:r>
-          </w:p>
-        </w:tc>
-        <w:tc>
-          <w:tcPr>
-            <w:tcW w:type="dxa" w:w="2160"/>
-          </w:tcPr>
-          <w:p>
-            <w:r>
-              <w:t>0.1</w:t>
-            </w:r>
-          </w:p>
-        </w:tc>
-        <w:tc>
-          <w:tcPr>
-            <w:tcW w:type="dxa" w:w="2160"/>
-          </w:tcPr>
-          <w:p>
-            <w:r>
-              <w:t>10</w:t>
-            </w:r>
-          </w:p>
-        </w:tc>
-      </w:tr>
-      <w:tr>
-        <w:tc>
-          <w:tcPr>
-            <w:tcW w:type="dxa" w:w="2160"/>
-          </w:tcPr>
-          <w:p>
-            <w:r>
-              <w:t>43</w:t>
-            </w:r>
-          </w:p>
-        </w:tc>
-        <w:tc>
-          <w:tcPr>
-            <w:tcW w:type="dxa" w:w="2160"/>
-          </w:tcPr>
-          <w:p>
-            <w:r>
-              <w:t>Adosado</w:t>
-            </w:r>
-          </w:p>
-        </w:tc>
-        <w:tc>
-          <w:tcPr>
-            <w:tcW w:type="dxa" w:w="2160"/>
-          </w:tcPr>
-          <w:p>
-            <w:r>
-              <w:t>0.2</w:t>
-            </w:r>
-          </w:p>
-        </w:tc>
-        <w:tc>
-          <w:tcPr>
-            <w:tcW w:type="dxa" w:w="2160"/>
-          </w:tcPr>
-          <w:p>
-            <w:r>
-              <w:t>10</w:t>
-            </w:r>
-          </w:p>
-        </w:tc>
-      </w:tr>
-      <w:tr>
-        <w:tc>
-          <w:tcPr>
-            <w:tcW w:type="dxa" w:w="2160"/>
-          </w:tcPr>
-          <w:p>
-            <w:r>
-              <w:t>44</w:t>
-            </w:r>
-          </w:p>
-        </w:tc>
-        <w:tc>
-          <w:tcPr>
-            <w:tcW w:type="dxa" w:w="2160"/>
-          </w:tcPr>
-          <w:p>
-            <w:r>
-              <w:t>Adosado</w:t>
-            </w:r>
-          </w:p>
-        </w:tc>
-        <w:tc>
-          <w:tcPr>
-            <w:tcW w:type="dxa" w:w="2160"/>
-          </w:tcPr>
-          <w:p>
-            <w:r>
-              <w:t>0.1</w:t>
-            </w:r>
-          </w:p>
-        </w:tc>
-        <w:tc>
-          <w:tcPr>
-            <w:tcW w:type="dxa" w:w="2160"/>
-          </w:tcPr>
-          <w:p>
-            <w:r>
-              <w:t>10</w:t>
-            </w:r>
-          </w:p>
-        </w:tc>
-      </w:tr>
-      <w:tr>
-        <w:tc>
-          <w:tcPr>
-            <w:tcW w:type="dxa" w:w="2160"/>
-          </w:tcPr>
-          <w:p>
-            <w:r>
-              <w:t>45</w:t>
-            </w:r>
-          </w:p>
-        </w:tc>
-        <w:tc>
-          <w:tcPr>
-            <w:tcW w:type="dxa" w:w="2160"/>
-          </w:tcPr>
-          <w:p>
-            <w:r>
-              <w:t>Adozado</w:t>
-            </w:r>
-          </w:p>
-        </w:tc>
-        <w:tc>
-          <w:tcPr>
-            <w:tcW w:type="dxa" w:w="2160"/>
-          </w:tcPr>
-          <w:p>
-            <w:r>
-              <w:t>0.2</w:t>
-            </w:r>
-          </w:p>
-        </w:tc>
-        <w:tc>
-          <w:tcPr>
-            <w:tcW w:type="dxa" w:w="2160"/>
-          </w:tcPr>
-          <w:p>
-            <w:r>
-              <w:t>10</w:t>
-            </w:r>
-          </w:p>
-        </w:tc>
-      </w:tr>
-    </w:tbl>
-    <w:p/>
-    <w:p>
-      <w:r>
-        <w:rPr>
-          <w:b/>
-        </w:rPr>
-        <w:t xml:space="preserve">Total bloque 9: </w:t>
-      </w:r>
-      <w:r>
-        <w:t>12.2 km, 61 min, ~6 baterias</w:t>
-      </w:r>
-    </w:p>
-    <w:p/>
-    <w:p>
-      <w:r>
-        <w:br w:type="page"/>
-      </w:r>
-    </w:p>
-    <w:p>
-      <w:pPr>
-        <w:pStyle w:val="Heading1"/>
-      </w:pPr>
-      <w:r>
-        <w:t>Calendario Resumido</w:t>
+        <w:t>Detalle por Dia</w:t>
       </w:r>
     </w:p>
     <w:tbl>
@@ -2725,7 +104,7 @@
           </w:tcPr>
           <w:p>
             <w:r>
-              <w:t>Bloque</w:t>
+              <w:t>Actividad</w:t>
             </w:r>
           </w:p>
         </w:tc>
@@ -2745,7 +124,7 @@
           </w:tcPr>
           <w:p>
             <w:r>
-              <w:t>Notas</w:t>
+              <w:t>Segmentos</w:t>
             </w:r>
           </w:p>
         </w:tc>
@@ -2767,17 +146,18 @@
           </w:tcPr>
           <w:p>
             <w:r>
-              <w:t>01/04/2026</w:t>
+              <w:t>30/03/2026</w:t>
             </w:r>
           </w:p>
         </w:tc>
         <w:tc>
           <w:tcPr>
             <w:tcW w:type="dxa" w:w="1728"/>
+            <w:shd w:fill="D9E2F3"/>
           </w:tcPr>
           <w:p>
             <w:r>
-              <w:t>Bloque 1</w:t>
+              <w:t>Bloque 1: Vuelo</w:t>
             </w:r>
           </w:p>
         </w:tc>
@@ -2797,7 +177,7 @@
           </w:tcPr>
           <w:p>
             <w:r>
-              <w:t>4 segmentos</w:t>
+              <w:t>4</w:t>
             </w:r>
           </w:p>
         </w:tc>
@@ -2819,7 +199,18 @@
           </w:tcPr>
           <w:p>
             <w:r>
-              <w:t>01/04/2026</w:t>
+              <w:t>31/03/2026</w:t>
+            </w:r>
+          </w:p>
+        </w:tc>
+        <w:tc>
+          <w:tcPr>
+            <w:tcW w:type="dxa" w:w="1728"/>
+            <w:shd w:fill="E2EFDA"/>
+          </w:tcPr>
+          <w:p>
+            <w:r>
+              <w:t>Bloque 1: Procesamiento</w:t>
             </w:r>
           </w:p>
         </w:tc>
@@ -2829,7 +220,7 @@
           </w:tcPr>
           <w:p>
             <w:r>
-              <w:t>Bloque 2</w:t>
+              <w:t>-</w:t>
             </w:r>
           </w:p>
         </w:tc>
@@ -2839,17 +230,7 @@
           </w:tcPr>
           <w:p>
             <w:r>
-              <w:t>50.0</w:t>
-            </w:r>
-          </w:p>
-        </w:tc>
-        <w:tc>
-          <w:tcPr>
-            <w:tcW w:type="dxa" w:w="1728"/>
-          </w:tcPr>
-          <w:p>
-            <w:r>
-              <w:t>5 segmentos</w:t>
+              <w:t>-</w:t>
             </w:r>
           </w:p>
         </w:tc>
@@ -2878,10 +259,11 @@
         <w:tc>
           <w:tcPr>
             <w:tcW w:type="dxa" w:w="1728"/>
+            <w:shd w:fill="D9E2F3"/>
           </w:tcPr>
           <w:p>
             <w:r>
-              <w:t>Bloque 3</w:t>
+              <w:t>Bloque 2: Vuelo</w:t>
             </w:r>
           </w:p>
         </w:tc>
@@ -2901,7 +283,7 @@
           </w:tcPr>
           <w:p>
             <w:r>
-              <w:t>9 segmentos</w:t>
+              <w:t>5</w:t>
             </w:r>
           </w:p>
         </w:tc>
@@ -2930,10 +312,11 @@
         <w:tc>
           <w:tcPr>
             <w:tcW w:type="dxa" w:w="1728"/>
+            <w:shd w:fill="E2EFDA"/>
           </w:tcPr>
           <w:p>
             <w:r>
-              <w:t>Bloque 4</w:t>
+              <w:t>Bloque 2: Procesamiento</w:t>
             </w:r>
           </w:p>
         </w:tc>
@@ -2943,7 +326,7 @@
           </w:tcPr>
           <w:p>
             <w:r>
-              <w:t>50.0</w:t>
+              <w:t>-</w:t>
             </w:r>
           </w:p>
         </w:tc>
@@ -2953,7 +336,7 @@
           </w:tcPr>
           <w:p>
             <w:r>
-              <w:t>3 segmentos</w:t>
+              <w:t>-</w:t>
             </w:r>
           </w:p>
         </w:tc>
@@ -2975,17 +358,18 @@
           </w:tcPr>
           <w:p>
             <w:r>
-              <w:t>02/04/2026</w:t>
+              <w:t>03/04/2026</w:t>
             </w:r>
           </w:p>
         </w:tc>
         <w:tc>
           <w:tcPr>
             <w:tcW w:type="dxa" w:w="1728"/>
+            <w:shd w:fill="D9E2F3"/>
           </w:tcPr>
           <w:p>
             <w:r>
-              <w:t>Bloque 5</w:t>
+              <w:t>Bloque 3: Vuelo</w:t>
             </w:r>
           </w:p>
         </w:tc>
@@ -3005,7 +389,7 @@
           </w:tcPr>
           <w:p>
             <w:r>
-              <w:t>4 segmentos</w:t>
+              <w:t>9</w:t>
             </w:r>
           </w:p>
         </w:tc>
@@ -3027,7 +411,18 @@
           </w:tcPr>
           <w:p>
             <w:r>
-              <w:t>02/04/2026</w:t>
+              <w:t>04/04/2026</w:t>
+            </w:r>
+          </w:p>
+        </w:tc>
+        <w:tc>
+          <w:tcPr>
+            <w:tcW w:type="dxa" w:w="1728"/>
+            <w:shd w:fill="E2EFDA"/>
+          </w:tcPr>
+          <w:p>
+            <w:r>
+              <w:t>Bloque 3: Procesamiento</w:t>
             </w:r>
           </w:p>
         </w:tc>
@@ -3037,7 +432,7 @@
           </w:tcPr>
           <w:p>
             <w:r>
-              <w:t>Bloque 6</w:t>
+              <w:t>-</w:t>
             </w:r>
           </w:p>
         </w:tc>
@@ -3047,17 +442,7 @@
           </w:tcPr>
           <w:p>
             <w:r>
-              <w:t>50.0</w:t>
-            </w:r>
-          </w:p>
-        </w:tc>
-        <w:tc>
-          <w:tcPr>
-            <w:tcW w:type="dxa" w:w="1728"/>
-          </w:tcPr>
-          <w:p>
-            <w:r>
-              <w:t>7 segmentos</w:t>
+              <w:t>-</w:t>
             </w:r>
           </w:p>
         </w:tc>
@@ -3079,7 +464,18 @@
           </w:tcPr>
           <w:p>
             <w:r>
-              <w:t>03/04/2026</w:t>
+              <w:t>05/04/2026</w:t>
+            </w:r>
+          </w:p>
+        </w:tc>
+        <w:tc>
+          <w:tcPr>
+            <w:tcW w:type="dxa" w:w="1728"/>
+            <w:shd w:fill="D9E2F3"/>
+          </w:tcPr>
+          <w:p>
+            <w:r>
+              <w:t>Bloque 4: Vuelo</w:t>
             </w:r>
           </w:p>
         </w:tc>
@@ -3089,7 +485,7 @@
           </w:tcPr>
           <w:p>
             <w:r>
-              <w:t>DESCANSO</w:t>
+              <w:t>50.0</w:t>
             </w:r>
           </w:p>
         </w:tc>
@@ -3099,17 +495,7 @@
           </w:tcPr>
           <w:p>
             <w:r>
-              <w:t>-</w:t>
-            </w:r>
-          </w:p>
-        </w:tc>
-        <w:tc>
-          <w:tcPr>
-            <w:tcW w:type="dxa" w:w="1728"/>
-          </w:tcPr>
-          <w:p>
-            <w:r>
-              <w:t>Mantenimiento</w:t>
+              <w:t>3</w:t>
             </w:r>
           </w:p>
         </w:tc>
@@ -3131,7 +517,18 @@
           </w:tcPr>
           <w:p>
             <w:r>
-              <w:t>04/04/2026</w:t>
+              <w:t>06/04/2026</w:t>
+            </w:r>
+          </w:p>
+        </w:tc>
+        <w:tc>
+          <w:tcPr>
+            <w:tcW w:type="dxa" w:w="1728"/>
+            <w:shd w:fill="E2EFDA"/>
+          </w:tcPr>
+          <w:p>
+            <w:r>
+              <w:t>Bloque 4: Procesamiento</w:t>
             </w:r>
           </w:p>
         </w:tc>
@@ -3141,7 +538,7 @@
           </w:tcPr>
           <w:p>
             <w:r>
-              <w:t>Bloque 7</w:t>
+              <w:t>-</w:t>
             </w:r>
           </w:p>
         </w:tc>
@@ -3151,17 +548,7 @@
           </w:tcPr>
           <w:p>
             <w:r>
-              <w:t>50.0</w:t>
-            </w:r>
-          </w:p>
-        </w:tc>
-        <w:tc>
-          <w:tcPr>
-            <w:tcW w:type="dxa" w:w="1728"/>
-          </w:tcPr>
-          <w:p>
-            <w:r>
-              <w:t>4 segmentos</w:t>
+              <w:t>-</w:t>
             </w:r>
           </w:p>
         </w:tc>
@@ -3183,17 +570,18 @@
           </w:tcPr>
           <w:p>
             <w:r>
-              <w:t>04/04/2026</w:t>
+              <w:t>07/04/2026</w:t>
             </w:r>
           </w:p>
         </w:tc>
         <w:tc>
           <w:tcPr>
             <w:tcW w:type="dxa" w:w="1728"/>
+            <w:shd w:fill="D9E2F3"/>
           </w:tcPr>
           <w:p>
             <w:r>
-              <w:t>Bloque 8</w:t>
+              <w:t>Bloque 5: Vuelo</w:t>
             </w:r>
           </w:p>
         </w:tc>
@@ -3213,7 +601,7 @@
           </w:tcPr>
           <w:p>
             <w:r>
-              <w:t>3 segmentos</w:t>
+              <w:t>4</w:t>
             </w:r>
           </w:p>
         </w:tc>
@@ -3235,7 +623,18 @@
           </w:tcPr>
           <w:p>
             <w:r>
-              <w:t>04/04/2026</w:t>
+              <w:t>08/04/2026</w:t>
+            </w:r>
+          </w:p>
+        </w:tc>
+        <w:tc>
+          <w:tcPr>
+            <w:tcW w:type="dxa" w:w="1728"/>
+            <w:shd w:fill="E2EFDA"/>
+          </w:tcPr>
+          <w:p>
+            <w:r>
+              <w:t>Bloque 5: Procesamiento</w:t>
             </w:r>
           </w:p>
         </w:tc>
@@ -3245,7 +644,368 @@
           </w:tcPr>
           <w:p>
             <w:r>
-              <w:t>Bloque 9</w:t>
+              <w:t>-</w:t>
+            </w:r>
+          </w:p>
+        </w:tc>
+        <w:tc>
+          <w:tcPr>
+            <w:tcW w:type="dxa" w:w="1728"/>
+          </w:tcPr>
+          <w:p>
+            <w:r>
+              <w:t>-</w:t>
+            </w:r>
+          </w:p>
+        </w:tc>
+      </w:tr>
+      <w:tr>
+        <w:tc>
+          <w:tcPr>
+            <w:tcW w:type="dxa" w:w="1728"/>
+          </w:tcPr>
+          <w:p>
+            <w:r>
+              <w:t>11</w:t>
+            </w:r>
+          </w:p>
+        </w:tc>
+        <w:tc>
+          <w:tcPr>
+            <w:tcW w:type="dxa" w:w="1728"/>
+          </w:tcPr>
+          <w:p>
+            <w:r>
+              <w:t>09/04/2026</w:t>
+            </w:r>
+          </w:p>
+        </w:tc>
+        <w:tc>
+          <w:tcPr>
+            <w:tcW w:type="dxa" w:w="1728"/>
+            <w:shd w:fill="D9E2F3"/>
+          </w:tcPr>
+          <w:p>
+            <w:r>
+              <w:t>Bloque 6: Vuelo</w:t>
+            </w:r>
+          </w:p>
+        </w:tc>
+        <w:tc>
+          <w:tcPr>
+            <w:tcW w:type="dxa" w:w="1728"/>
+          </w:tcPr>
+          <w:p>
+            <w:r>
+              <w:t>50.0</w:t>
+            </w:r>
+          </w:p>
+        </w:tc>
+        <w:tc>
+          <w:tcPr>
+            <w:tcW w:type="dxa" w:w="1728"/>
+          </w:tcPr>
+          <w:p>
+            <w:r>
+              <w:t>7</w:t>
+            </w:r>
+          </w:p>
+        </w:tc>
+      </w:tr>
+      <w:tr>
+        <w:tc>
+          <w:tcPr>
+            <w:tcW w:type="dxa" w:w="1728"/>
+          </w:tcPr>
+          <w:p>
+            <w:r>
+              <w:t>12</w:t>
+            </w:r>
+          </w:p>
+        </w:tc>
+        <w:tc>
+          <w:tcPr>
+            <w:tcW w:type="dxa" w:w="1728"/>
+          </w:tcPr>
+          <w:p>
+            <w:r>
+              <w:t>10/04/2026</w:t>
+            </w:r>
+          </w:p>
+        </w:tc>
+        <w:tc>
+          <w:tcPr>
+            <w:tcW w:type="dxa" w:w="1728"/>
+            <w:shd w:fill="E2EFDA"/>
+          </w:tcPr>
+          <w:p>
+            <w:r>
+              <w:t>Bloque 6: Procesamiento</w:t>
+            </w:r>
+          </w:p>
+        </w:tc>
+        <w:tc>
+          <w:tcPr>
+            <w:tcW w:type="dxa" w:w="1728"/>
+          </w:tcPr>
+          <w:p>
+            <w:r>
+              <w:t>-</w:t>
+            </w:r>
+          </w:p>
+        </w:tc>
+        <w:tc>
+          <w:tcPr>
+            <w:tcW w:type="dxa" w:w="1728"/>
+          </w:tcPr>
+          <w:p>
+            <w:r>
+              <w:t>-</w:t>
+            </w:r>
+          </w:p>
+        </w:tc>
+      </w:tr>
+      <w:tr>
+        <w:tc>
+          <w:tcPr>
+            <w:tcW w:type="dxa" w:w="1728"/>
+          </w:tcPr>
+          <w:p>
+            <w:r>
+              <w:t>13</w:t>
+            </w:r>
+          </w:p>
+        </w:tc>
+        <w:tc>
+          <w:tcPr>
+            <w:tcW w:type="dxa" w:w="1728"/>
+          </w:tcPr>
+          <w:p>
+            <w:r>
+              <w:t>11/04/2026</w:t>
+            </w:r>
+          </w:p>
+        </w:tc>
+        <w:tc>
+          <w:tcPr>
+            <w:tcW w:type="dxa" w:w="1728"/>
+            <w:shd w:fill="D9E2F3"/>
+          </w:tcPr>
+          <w:p>
+            <w:r>
+              <w:t>Bloque 7: Vuelo</w:t>
+            </w:r>
+          </w:p>
+        </w:tc>
+        <w:tc>
+          <w:tcPr>
+            <w:tcW w:type="dxa" w:w="1728"/>
+          </w:tcPr>
+          <w:p>
+            <w:r>
+              <w:t>50.0</w:t>
+            </w:r>
+          </w:p>
+        </w:tc>
+        <w:tc>
+          <w:tcPr>
+            <w:tcW w:type="dxa" w:w="1728"/>
+          </w:tcPr>
+          <w:p>
+            <w:r>
+              <w:t>4</w:t>
+            </w:r>
+          </w:p>
+        </w:tc>
+      </w:tr>
+      <w:tr>
+        <w:tc>
+          <w:tcPr>
+            <w:tcW w:type="dxa" w:w="1728"/>
+          </w:tcPr>
+          <w:p>
+            <w:r>
+              <w:t>14</w:t>
+            </w:r>
+          </w:p>
+        </w:tc>
+        <w:tc>
+          <w:tcPr>
+            <w:tcW w:type="dxa" w:w="1728"/>
+          </w:tcPr>
+          <w:p>
+            <w:r>
+              <w:t>12/04/2026</w:t>
+            </w:r>
+          </w:p>
+        </w:tc>
+        <w:tc>
+          <w:tcPr>
+            <w:tcW w:type="dxa" w:w="1728"/>
+            <w:shd w:fill="E2EFDA"/>
+          </w:tcPr>
+          <w:p>
+            <w:r>
+              <w:t>Bloque 7: Procesamiento</w:t>
+            </w:r>
+          </w:p>
+        </w:tc>
+        <w:tc>
+          <w:tcPr>
+            <w:tcW w:type="dxa" w:w="1728"/>
+          </w:tcPr>
+          <w:p>
+            <w:r>
+              <w:t>-</w:t>
+            </w:r>
+          </w:p>
+        </w:tc>
+        <w:tc>
+          <w:tcPr>
+            <w:tcW w:type="dxa" w:w="1728"/>
+          </w:tcPr>
+          <w:p>
+            <w:r>
+              <w:t>-</w:t>
+            </w:r>
+          </w:p>
+        </w:tc>
+      </w:tr>
+      <w:tr>
+        <w:tc>
+          <w:tcPr>
+            <w:tcW w:type="dxa" w:w="1728"/>
+          </w:tcPr>
+          <w:p>
+            <w:r>
+              <w:t>15</w:t>
+            </w:r>
+          </w:p>
+        </w:tc>
+        <w:tc>
+          <w:tcPr>
+            <w:tcW w:type="dxa" w:w="1728"/>
+          </w:tcPr>
+          <w:p>
+            <w:r>
+              <w:t>13/04/2026</w:t>
+            </w:r>
+          </w:p>
+        </w:tc>
+        <w:tc>
+          <w:tcPr>
+            <w:tcW w:type="dxa" w:w="1728"/>
+            <w:shd w:fill="D9E2F3"/>
+          </w:tcPr>
+          <w:p>
+            <w:r>
+              <w:t>Bloque 8: Vuelo</w:t>
+            </w:r>
+          </w:p>
+        </w:tc>
+        <w:tc>
+          <w:tcPr>
+            <w:tcW w:type="dxa" w:w="1728"/>
+          </w:tcPr>
+          <w:p>
+            <w:r>
+              <w:t>50.0</w:t>
+            </w:r>
+          </w:p>
+        </w:tc>
+        <w:tc>
+          <w:tcPr>
+            <w:tcW w:type="dxa" w:w="1728"/>
+          </w:tcPr>
+          <w:p>
+            <w:r>
+              <w:t>3</w:t>
+            </w:r>
+          </w:p>
+        </w:tc>
+      </w:tr>
+      <w:tr>
+        <w:tc>
+          <w:tcPr>
+            <w:tcW w:type="dxa" w:w="1728"/>
+          </w:tcPr>
+          <w:p>
+            <w:r>
+              <w:t>16</w:t>
+            </w:r>
+          </w:p>
+        </w:tc>
+        <w:tc>
+          <w:tcPr>
+            <w:tcW w:type="dxa" w:w="1728"/>
+          </w:tcPr>
+          <w:p>
+            <w:r>
+              <w:t>14/04/2026</w:t>
+            </w:r>
+          </w:p>
+        </w:tc>
+        <w:tc>
+          <w:tcPr>
+            <w:tcW w:type="dxa" w:w="1728"/>
+            <w:shd w:fill="E2EFDA"/>
+          </w:tcPr>
+          <w:p>
+            <w:r>
+              <w:t>Bloque 8: Procesamiento</w:t>
+            </w:r>
+          </w:p>
+        </w:tc>
+        <w:tc>
+          <w:tcPr>
+            <w:tcW w:type="dxa" w:w="1728"/>
+          </w:tcPr>
+          <w:p>
+            <w:r>
+              <w:t>-</w:t>
+            </w:r>
+          </w:p>
+        </w:tc>
+        <w:tc>
+          <w:tcPr>
+            <w:tcW w:type="dxa" w:w="1728"/>
+          </w:tcPr>
+          <w:p>
+            <w:r>
+              <w:t>-</w:t>
+            </w:r>
+          </w:p>
+        </w:tc>
+      </w:tr>
+      <w:tr>
+        <w:tc>
+          <w:tcPr>
+            <w:tcW w:type="dxa" w:w="1728"/>
+          </w:tcPr>
+          <w:p>
+            <w:r>
+              <w:t>17</w:t>
+            </w:r>
+          </w:p>
+        </w:tc>
+        <w:tc>
+          <w:tcPr>
+            <w:tcW w:type="dxa" w:w="1728"/>
+          </w:tcPr>
+          <w:p>
+            <w:r>
+              <w:t>15/04/2026</w:t>
+            </w:r>
+          </w:p>
+        </w:tc>
+        <w:tc>
+          <w:tcPr>
+            <w:tcW w:type="dxa" w:w="1728"/>
+            <w:shd w:fill="D9E2F3"/>
+          </w:tcPr>
+          <w:p>
+            <w:r>
+              <w:t>Bloque 9: Vuelo</w:t>
             </w:r>
           </w:p>
         </w:tc>
@@ -3265,121 +1025,102 @@
           </w:tcPr>
           <w:p>
             <w:r>
-              <w:t>6 segmentos</w:t>
+              <w:t>6</w:t>
+            </w:r>
+          </w:p>
+        </w:tc>
+      </w:tr>
+      <w:tr>
+        <w:tc>
+          <w:tcPr>
+            <w:tcW w:type="dxa" w:w="1728"/>
+          </w:tcPr>
+          <w:p>
+            <w:r>
+              <w:t>18</w:t>
+            </w:r>
+          </w:p>
+        </w:tc>
+        <w:tc>
+          <w:tcPr>
+            <w:tcW w:type="dxa" w:w="1728"/>
+          </w:tcPr>
+          <w:p>
+            <w:r>
+              <w:t>16/04/2026</w:t>
+            </w:r>
+          </w:p>
+        </w:tc>
+        <w:tc>
+          <w:tcPr>
+            <w:tcW w:type="dxa" w:w="1728"/>
+            <w:shd w:fill="E2EFDA"/>
+          </w:tcPr>
+          <w:p>
+            <w:r>
+              <w:t>Bloque 9: Procesamiento</w:t>
+            </w:r>
+          </w:p>
+        </w:tc>
+        <w:tc>
+          <w:tcPr>
+            <w:tcW w:type="dxa" w:w="1728"/>
+          </w:tcPr>
+          <w:p>
+            <w:r>
+              <w:t>-</w:t>
+            </w:r>
+          </w:p>
+        </w:tc>
+        <w:tc>
+          <w:tcPr>
+            <w:tcW w:type="dxa" w:w="1728"/>
+          </w:tcPr>
+          <w:p>
+            <w:r>
+              <w:t>-</w:t>
             </w:r>
           </w:p>
         </w:tc>
       </w:tr>
     </w:tbl>
-    <w:p>
-      <w:r>
-        <w:br w:type="page"/>
-      </w:r>
-    </w:p>
+    <w:p/>
     <w:p>
       <w:pPr>
         <w:pStyle w:val="Heading1"/>
       </w:pPr>
       <w:r>
-        <w:t>Equipo Necesario por Dia</w:t>
+        <w:t>Equipo por Dia</w:t>
       </w:r>
     </w:p>
     <w:p>
       <w:r>
-        <w:t>• 2 Drones con LiDAR (1 principal + 1 backup)</w:t>
+        <w:t>• 2 Drones (1 principal LiDAR + 1 backup)</w:t>
       </w:r>
     </w:p>
     <w:p>
       <w:r>
-        <w:t>• 8 Baterias por dron (4 cargando, 4 volando)</w:t>
+        <w:t>• 8 Baterias por dron</w:t>
       </w:r>
     </w:p>
     <w:p>
       <w:r>
-        <w:t>• 2 RTK (1 base + 1 rover)</w:t>
+        <w:t>• 2 RTK (base + rover)</w:t>
       </w:r>
     </w:p>
     <w:p>
       <w:r>
-        <w:t>• 2 Tablets con flight plan cargado</w:t>
+        <w:t>• 2 Laptops</w:t>
       </w:r>
     </w:p>
     <w:p>
       <w:r>
-        <w:t>• 2 Laptops para procesamiento</w:t>
+        <w:t>• 2 Discos duros externos</w:t>
       </w:r>
     </w:p>
     <w:p>
       <w:r>
-        <w:t>• 2 Discos duros externos (backup)</w:t>
-      </w:r>
-    </w:p>
-    <w:p>
-      <w:r>
-        <w:t>• SD Cards: 4 por dron</w:t>
-      </w:r>
-    </w:p>
-    <w:p>
-      <w:r>
-        <w:t>• Kit de herramientas basico</w:t>
-      </w:r>
-    </w:p>
-    <w:p>
-      <w:r>
-        <w:t>• Botiquin de primeros aux</w:t>
-      </w:r>
-    </w:p>
-    <w:p>
-      <w:r>
-        <w:t>• Radio comunicacion (2 unidades)</w:t>
-      </w:r>
-    </w:p>
-    <w:p>
-      <w:r>
-        <w:t>• Agua y snacks (zona rural)</w:t>
-      </w:r>
-    </w:p>
-    <w:p>
-      <w:r>
-        <w:t>• Cargador de 12V para vehiculo</w:t>
-      </w:r>
-    </w:p>
-    <w:p>
-      <w:pPr>
-        <w:pStyle w:val="Heading1"/>
-      </w:pPr>
-      <w:r>
-        <w:t>Notas Importantes</w:t>
-      </w:r>
-    </w:p>
-    <w:p>
-      <w:r>
-        <w:t>• Verificar weather forecast cada manana antes de volar</w:t>
-      </w:r>
-    </w:p>
-    <w:p>
-      <w:r>
-        <w:t>• Respaldar datos al menos 2 veces al dia</w:t>
-      </w:r>
-    </w:p>
-    <w:p>
-      <w:r>
-        <w:t>• Verificar linea de vista RTK antes de cada vuelo</w:t>
-      </w:r>
-    </w:p>
-    <w:p>
-      <w:r>
-        <w:t>• Documentar cualquier incidencia en bitacora</w:t>
-      </w:r>
-    </w:p>
-    <w:p>
-      <w:r>
-        <w:t>• Coordinar con autoridades locales 1 dia antes</w:t>
-      </w:r>
-    </w:p>
-    <w:p>
-      <w:r>
-        <w:t>• Tiempo estimado incluye setup y breakdown</w:t>
+        <w:t>• SD Cards</w:t>
       </w:r>
     </w:p>
     <w:sectPr>

</xml_diff>